<commit_message>
docs: Inicio de priorización 2da tanda, inicio especificacion CU21
</commit_message>
<xml_diff>
--- a/Devoluciones Presentaciones_Kairos_NexTech.docx
+++ b/Devoluciones Presentaciones_Kairos_NexTech.docx
@@ -94,7 +94,76 @@
         <w:rPr>
           <w:rtl w:val="0"/>
         </w:rPr>
-        <w:t xml:space="preserve">…</w:t>
+        <w:t xml:space="preserve">El software, en el registro de tiempos por cronómetro, quizás el “stop” puede conducir a confusión ya que uno puede interpretar que involucra una cancelación, es decir, no saber si se va a guardar.</w:t>
+      </w:r>
+    </w:p>
+    <w:p>
+      <w:pPr>
+        <w:numPr>
+          <w:ilvl w:val="0"/>
+          <w:numId w:val="2"/>
+        </w:numPr>
+        <w:ind w:left="720" w:hanging="360"/>
+        <w:jc w:val="both"/>
+        <w:rPr>
+          <w:u w:val="none"/>
+        </w:rPr>
+      </w:pPr>
+      <w:r>
+        <w:rPr>
+          <w:rtl w:val="0"/>
+        </w:rPr>
+        <w:t xml:space="preserve">Está bien que mostremos objetivos cumplidos y no cumplidos durante la iteración, pero estaría bueno ver las tareas en particular que fueron cumplidas o cuando, como hacen los chicos de codevit.</w:t>
+      </w:r>
+    </w:p>
+    <w:p>
+      <w:pPr>
+        <w:numPr>
+          <w:ilvl w:val="0"/>
+          <w:numId w:val="2"/>
+        </w:numPr>
+        <w:ind w:left="720" w:hanging="360"/>
+        <w:jc w:val="both"/>
+        <w:rPr>
+          <w:u w:val="none"/>
+        </w:rPr>
+      </w:pPr>
+      <w:r>
+        <w:rPr>
+          <w:rtl w:val="0"/>
+        </w:rPr>
+        <w:t xml:space="preserve">Hubo un error que saltó pero no a través de un caso de prueba, tenerlo en cuenta.</w:t>
+      </w:r>
+    </w:p>
+    <w:p>
+      <w:pPr>
+        <w:numPr>
+          <w:ilvl w:val="0"/>
+          <w:numId w:val="2"/>
+        </w:numPr>
+        <w:ind w:left="720" w:hanging="360"/>
+        <w:jc w:val="both"/>
+        <w:rPr>
+          <w:u w:val="none"/>
+        </w:rPr>
+      </w:pPr>
+      <w:r>
+        <w:rPr>
+          <w:rtl w:val="0"/>
+        </w:rPr>
+        <w:t xml:space="preserve">No está siendo efectiva la forma de representar los riesgos. No entendí bien por qué.</w:t>
+      </w:r>
+    </w:p>
+    <w:p>
+      <w:pPr>
+        <w:ind w:left="0" w:firstLine="0"/>
+        <w:jc w:val="both"/>
+        <w:rPr/>
+      </w:pPr>
+      <w:r>
+        <w:rPr>
+          <w:rtl w:val="0"/>
+        </w:rPr>
       </w:r>
     </w:p>
     <w:p>

</xml_diff>

<commit_message>
docs: inicio de manuales
</commit_message>
<xml_diff>
--- a/Devoluciones Presentaciones_Kairos_NexTech.docx
+++ b/Devoluciones Presentaciones_Kairos_NexTech.docx
@@ -5,10 +5,7 @@
     <w:p>
       <w:pPr>
         <w:jc w:val="center"/>
-        <w:rPr>
-          <w:sz w:val="38"/>
-          <w:szCs w:val="38"/>
-        </w:rPr>
+        <w:rPr/>
       </w:pPr>
       <w:r>
         <w:rPr>
@@ -19,28 +16,55 @@
         </w:rPr>
         <w:t xml:space="preserve">•┈••✦ Etapa Construcción Iteración 2 ✦••┈•</w:t>
       </w:r>
-    </w:p>
-    <w:p>
-      <w:pPr>
-        <w:jc w:val="both"/>
-        <w:rPr/>
-      </w:pPr>
-      <w:r>
-        <w:rPr>
-          <w:rtl w:val="0"/>
-        </w:rPr>
-      </w:r>
-    </w:p>
-    <w:p>
-      <w:pPr>
-        <w:jc w:val="both"/>
-        <w:rPr/>
-      </w:pPr>
-      <w:r>
-        <w:rPr>
-          <w:rtl w:val="0"/>
-        </w:rPr>
-        <w:t xml:space="preserve">07/11/2025 Casos de Prueba ejecutados para 2da tanda de CU</w:t>
+      <w:r>
+        <w:rPr>
+          <w:rtl w:val="0"/>
+        </w:rPr>
+      </w:r>
+    </w:p>
+    <w:p>
+      <w:pPr>
+        <w:jc w:val="center"/>
+        <w:rPr/>
+      </w:pPr>
+      <w:r>
+        <w:rPr>
+          <w:rtl w:val="0"/>
+        </w:rPr>
+      </w:r>
+    </w:p>
+    <w:p>
+      <w:pPr>
+        <w:jc w:val="both"/>
+        <w:rPr/>
+      </w:pPr>
+      <w:r>
+        <w:rPr>
+          <w:rtl w:val="0"/>
+        </w:rPr>
+      </w:r>
+    </w:p>
+    <w:p>
+      <w:pPr>
+        <w:jc w:val="both"/>
+        <w:rPr/>
+      </w:pPr>
+      <w:r>
+        <w:rPr>
+          <w:rtl w:val="0"/>
+        </w:rPr>
+        <w:t xml:space="preserve">07/11/2025 Casos de Prueba ejecutados para 2da tanda de CU, Implementación, cierre de iteración, plan de iteración construcción 3</w:t>
+      </w:r>
+    </w:p>
+    <w:p>
+      <w:pPr>
+        <w:jc w:val="both"/>
+        <w:rPr/>
+      </w:pPr>
+      <w:r>
+        <w:rPr>
+          <w:rtl w:val="0"/>
+        </w:rPr>
       </w:r>
     </w:p>
     <w:p>
@@ -59,7 +83,87 @@
         <w:rPr>
           <w:rtl w:val="0"/>
         </w:rPr>
-        <w:t xml:space="preserve">l</w:t>
+        <w:t xml:space="preserve">Cuando mostramos implementaciones no es necesario que probemos todo cuando lo presentamos, es decir, no mostrar todas las validaciones. Ir directamente a la funcionalidad.</w:t>
+      </w:r>
+    </w:p>
+    <w:p>
+      <w:pPr>
+        <w:numPr>
+          <w:ilvl w:val="0"/>
+          <w:numId w:val="9"/>
+        </w:numPr>
+        <w:ind w:left="720" w:hanging="360"/>
+        <w:jc w:val="both"/>
+        <w:rPr>
+          <w:u w:val="none"/>
+        </w:rPr>
+      </w:pPr>
+      <w:r>
+        <w:rPr>
+          <w:rtl w:val="0"/>
+        </w:rPr>
+        <w:t xml:space="preserve">Cuando tengamos que presentar es mejor tener el video de tu culo y mi fideo localmente porque el wifi de la unpa no es confiable y puede causar problemas para reproducirlo en el momento.</w:t>
+      </w:r>
+    </w:p>
+    <w:p>
+      <w:pPr>
+        <w:ind w:left="720" w:firstLine="0"/>
+        <w:jc w:val="both"/>
+        <w:rPr/>
+      </w:pPr>
+      <w:r>
+        <w:rPr>
+          <w:rtl w:val="0"/>
+        </w:rPr>
+      </w:r>
+    </w:p>
+    <w:p>
+      <w:pPr>
+        <w:numPr>
+          <w:ilvl w:val="0"/>
+          <w:numId w:val="9"/>
+        </w:numPr>
+        <w:ind w:left="720" w:hanging="360"/>
+        <w:jc w:val="both"/>
+        <w:rPr>
+          <w:u w:val="none"/>
+        </w:rPr>
+      </w:pPr>
+      <w:r>
+        <w:rPr>
+          <w:rtl w:val="0"/>
+        </w:rPr>
+        <w:t xml:space="preserve">Es recomendado tener un prototipo descartable de los casos de uso que sabemos que van a faltar cuando termine la cursada para tenerlos validado y definido cuando lo vayamos a implementar fuera de la cursada.</w:t>
+      </w:r>
+    </w:p>
+    <w:p>
+      <w:pPr>
+        <w:ind w:left="720" w:firstLine="0"/>
+        <w:jc w:val="both"/>
+        <w:rPr/>
+      </w:pPr>
+      <w:r>
+        <w:rPr>
+          <w:rtl w:val="0"/>
+        </w:rPr>
+      </w:r>
+    </w:p>
+    <w:p>
+      <w:pPr>
+        <w:numPr>
+          <w:ilvl w:val="0"/>
+          <w:numId w:val="9"/>
+        </w:numPr>
+        <w:ind w:left="720" w:hanging="360"/>
+        <w:jc w:val="both"/>
+        <w:rPr>
+          <w:u w:val="none"/>
+        </w:rPr>
+      </w:pPr>
+      <w:r>
+        <w:rPr>
+          <w:rtl w:val="0"/>
+        </w:rPr>
       </w:r>
     </w:p>
     <w:p>
@@ -1042,6 +1146,7 @@
       <w:r>
         <w:rPr>
           <w:b w:val="1"/>
+          <w:bCs w:val="1"/>
           <w:rtl w:val="0"/>
         </w:rPr>
         <w:t xml:space="preserve">riesgos</w:t>
@@ -4095,6 +4200,7 @@
       <w:r>
         <w:rPr>
           <w:b w:val="1"/>
+          <w:bCs w:val="1"/>
           <w:rtl w:val="0"/>
         </w:rPr>
         <w:t xml:space="preserve">Cortar la definición</w:t>
@@ -4133,6 +4239,7 @@
       <w:r>
         <w:rPr>
           <w:b w:val="1"/>
+          <w:bCs w:val="1"/>
           <w:rtl w:val="0"/>
         </w:rPr>
         <w:t xml:space="preserve">Definir</w:t>
@@ -4146,6 +4253,7 @@
       <w:r>
         <w:rPr>
           <w:b w:val="1"/>
+          <w:bCs w:val="1"/>
           <w:rtl w:val="0"/>
         </w:rPr>
         <w:t xml:space="preserve">responsables de la validación y verificación</w:t>
@@ -6838,6 +6946,7 @@
     </w:pPr>
     <w:rPr>
       <w:b w:val="0"/>
+      <w:bCs w:val="0"/>
       <w:sz w:val="32"/>
       <w:szCs w:val="32"/>
     </w:rPr>
@@ -6854,6 +6963,7 @@
     </w:pPr>
     <w:rPr>
       <w:b w:val="0"/>
+      <w:bCs w:val="0"/>
       <w:color w:val="434343"/>
       <w:sz w:val="28"/>
       <w:szCs w:val="28"/>
@@ -6903,6 +7013,7 @@
     </w:pPr>
     <w:rPr>
       <w:i w:val="1"/>
+      <w:iCs w:val="1"/>
       <w:color w:val="666666"/>
       <w:sz w:val="22"/>
       <w:szCs w:val="22"/>
@@ -6936,6 +7047,7 @@
     <w:rPr>
       <w:rFonts w:ascii="Arial" w:cs="Arial" w:eastAsia="Arial" w:hAnsi="Arial"/>
       <w:i w:val="0"/>
+      <w:iCs w:val="0"/>
       <w:color w:val="666666"/>
       <w:sz w:val="30"/>
       <w:szCs w:val="30"/>

</xml_diff>

<commit_message>
docs: actualización de documentos(cierre construcción y planificación post cursada)
</commit_message>
<xml_diff>
--- a/Devoluciones Presentaciones_Kairos_NexTech.docx
+++ b/Devoluciones Presentaciones_Kairos_NexTech.docx
@@ -24,11 +24,169 @@
     </w:p>
     <w:p>
       <w:pPr>
+        <w:jc w:val="left"/>
+        <w:rPr/>
+      </w:pPr>
+      <w:r>
+        <w:rPr>
+          <w:rtl w:val="0"/>
+        </w:rPr>
+      </w:r>
+    </w:p>
+    <w:p>
+      <w:pPr>
+        <w:jc w:val="left"/>
+        <w:rPr/>
+      </w:pPr>
+      <w:r>
+        <w:rPr>
+          <w:rtl w:val="0"/>
+        </w:rPr>
+        <w:t xml:space="preserve">11/11/2025 Especificación CUs, Inicio Manual de Usuario, Inicio Manual de Instalación</w:t>
+      </w:r>
+    </w:p>
+    <w:p>
+      <w:pPr>
+        <w:jc w:val="left"/>
+        <w:rPr/>
+      </w:pPr>
+      <w:r>
+        <w:rPr>
+          <w:rtl w:val="0"/>
+        </w:rPr>
+      </w:r>
+    </w:p>
+    <w:p>
+      <w:pPr>
+        <w:numPr>
+          <w:ilvl w:val="0"/>
+          <w:numId w:val="21"/>
+        </w:numPr>
+        <w:ind w:left="720" w:hanging="360"/>
+        <w:jc w:val="left"/>
+        <w:rPr>
+          <w:u w:val="none"/>
+        </w:rPr>
+      </w:pPr>
+      <w:r>
+        <w:rPr>
+          <w:rtl w:val="0"/>
+        </w:rPr>
+        <w:t xml:space="preserve">El manual de usuario, cuando se entrega suele ser una descripción de cada botón, lo que está mal. Debe poder explicar un poco los flujos de trabajo, como comenzar a hacer cosas, como guardar datos, etc. Los pasos para aprovechar las funcionalidades. Tipo instrucciones sin necesidad de enredarse en cosas técnicas.</w:t>
+      </w:r>
+    </w:p>
+    <w:p>
+      <w:pPr>
+        <w:ind w:left="720" w:firstLine="0"/>
+        <w:jc w:val="left"/>
+        <w:rPr/>
+      </w:pPr>
+      <w:r>
+        <w:rPr>
+          <w:rtl w:val="0"/>
+        </w:rPr>
+      </w:r>
+    </w:p>
+    <w:p>
+      <w:pPr>
+        <w:numPr>
+          <w:ilvl w:val="0"/>
+          <w:numId w:val="21"/>
+        </w:numPr>
+        <w:ind w:left="720" w:hanging="360"/>
+        <w:jc w:val="left"/>
+        <w:rPr>
+          <w:u w:val="none"/>
+        </w:rPr>
+      </w:pPr>
+      <w:r>
+        <w:rPr>
+          <w:rtl w:val="0"/>
+        </w:rPr>
+        <w:t xml:space="preserve">Transmitir mejor los errores encontrados (los más llamativos) en los casos de prueba ya que no  lo transmitimos.</w:t>
+      </w:r>
+    </w:p>
+    <w:p>
+      <w:pPr>
+        <w:ind w:left="720" w:firstLine="0"/>
+        <w:jc w:val="left"/>
+        <w:rPr/>
+      </w:pPr>
+      <w:r>
+        <w:rPr>
+          <w:rtl w:val="0"/>
+        </w:rPr>
+      </w:r>
+    </w:p>
+    <w:p>
+      <w:pPr>
+        <w:numPr>
+          <w:ilvl w:val="0"/>
+          <w:numId w:val="21"/>
+        </w:numPr>
+        <w:ind w:left="720" w:hanging="360"/>
+        <w:jc w:val="left"/>
+        <w:rPr>
+          <w:u w:val="none"/>
+        </w:rPr>
+      </w:pPr>
+      <w:r>
+        <w:rPr>
+          <w:rtl w:val="0"/>
+        </w:rPr>
+        <w:t xml:space="preserve">Manual de instalación: el manual de instalación pide demasiado, te pide que te instales muchas cosas. Podemos probar instalar solo MySql en reemplazo del xampp. Podríamos tratar de buscarle la vuelta para instalarlo de otra forma teniendo en cuenta lo mínimo requerido para que corra.</w:t>
+      </w:r>
+    </w:p>
+    <w:p>
+      <w:pPr>
+        <w:ind w:left="720" w:firstLine="0"/>
+        <w:jc w:val="left"/>
+        <w:rPr/>
+      </w:pPr>
+      <w:r>
+        <w:rPr>
+          <w:rtl w:val="0"/>
+        </w:rPr>
+      </w:r>
+    </w:p>
+    <w:p>
+      <w:pPr>
+        <w:jc w:val="left"/>
+        <w:rPr/>
+      </w:pPr>
+      <w:r>
+        <w:rPr>
+          <w:rtl w:val="0"/>
+        </w:rPr>
+      </w:r>
+    </w:p>
+    <w:p>
+      <w:pPr>
         <w:jc w:val="center"/>
         <w:rPr/>
       </w:pPr>
       <w:r>
         <w:rPr>
+          <w:rFonts w:ascii="Arial Unicode MS" w:cs="Arial Unicode MS" w:eastAsia="Arial Unicode MS" w:hAnsi="Arial Unicode MS"/>
+          <w:sz w:val="38"/>
+          <w:szCs w:val="38"/>
+          <w:rtl w:val="0"/>
+        </w:rPr>
+        <w:t xml:space="preserve">•┈••✦ ❤ ✦••┈•</w:t>
+      </w:r>
+      <w:r>
+        <w:rPr>
+          <w:rtl w:val="0"/>
+        </w:rPr>
+      </w:r>
+    </w:p>
+    <w:p>
+      <w:pPr>
+        <w:jc w:val="left"/>
+        <w:rPr/>
+      </w:pPr>
+      <w:r>
+        <w:rPr>
           <w:rtl w:val="0"/>
         </w:rPr>
       </w:r>
@@ -159,6 +317,50 @@
         <w:rPr>
           <w:u w:val="none"/>
         </w:rPr>
+      </w:pPr>
+      <w:r>
+        <w:rPr>
+          <w:rtl w:val="0"/>
+        </w:rPr>
+        <w:t xml:space="preserve">En la idea del manual de usuario a ninguno de los grupos se nos ocurrió salirnos de la plantilla de psi. Esta parte es algo que podemos hacer como nosotros queramos, puede estar integrado en el sistema, puede ser un video, puede ser, no se, un tutorial en el mismo sistema.</w:t>
+      </w:r>
+    </w:p>
+    <w:p>
+      <w:pPr>
+        <w:ind w:left="720" w:firstLine="0"/>
+        <w:jc w:val="both"/>
+        <w:rPr/>
+      </w:pPr>
+      <w:r>
+        <w:rPr>
+          <w:rtl w:val="0"/>
+        </w:rPr>
+      </w:r>
+    </w:p>
+    <w:p>
+      <w:pPr>
+        <w:numPr>
+          <w:ilvl w:val="0"/>
+          <w:numId w:val="9"/>
+        </w:numPr>
+        <w:ind w:left="720" w:hanging="360"/>
+        <w:jc w:val="both"/>
+        <w:rPr>
+          <w:u w:val="none"/>
+        </w:rPr>
+      </w:pPr>
+      <w:r>
+        <w:rPr>
+          <w:rtl w:val="0"/>
+        </w:rPr>
+        <w:t xml:space="preserve">Recomendación para los informes: tienen que ser consecuentes. Todos los documentos tienen encabezado y pie de página para que uno sepa lo que está leyendo.</w:t>
+      </w:r>
+    </w:p>
+    <w:p>
+      <w:pPr>
+        <w:ind w:left="0" w:firstLine="0"/>
+        <w:jc w:val="both"/>
+        <w:rPr/>
       </w:pPr>
       <w:r>
         <w:rPr>
@@ -6716,6 +6918,116 @@
     </w:lvl>
   </w:abstractNum>
   <w:abstractNum w:abstractNumId="20">
+    <w:lvl w:ilvl="0">
+      <w:start w:val="1"/>
+      <w:numFmt w:val="bullet"/>
+      <w:lvlText w:val="●"/>
+      <w:lvlJc w:val="left"/>
+      <w:pPr>
+        <w:ind w:left="720" w:hanging="360"/>
+      </w:pPr>
+      <w:rPr>
+        <w:u w:val="none"/>
+      </w:rPr>
+    </w:lvl>
+    <w:lvl w:ilvl="1">
+      <w:start w:val="1"/>
+      <w:numFmt w:val="bullet"/>
+      <w:lvlText w:val="○"/>
+      <w:lvlJc w:val="left"/>
+      <w:pPr>
+        <w:ind w:left="1440" w:hanging="360"/>
+      </w:pPr>
+      <w:rPr>
+        <w:u w:val="none"/>
+      </w:rPr>
+    </w:lvl>
+    <w:lvl w:ilvl="2">
+      <w:start w:val="1"/>
+      <w:numFmt w:val="bullet"/>
+      <w:lvlText w:val="■"/>
+      <w:lvlJc w:val="left"/>
+      <w:pPr>
+        <w:ind w:left="2160" w:hanging="360"/>
+      </w:pPr>
+      <w:rPr>
+        <w:u w:val="none"/>
+      </w:rPr>
+    </w:lvl>
+    <w:lvl w:ilvl="3">
+      <w:start w:val="1"/>
+      <w:numFmt w:val="bullet"/>
+      <w:lvlText w:val="●"/>
+      <w:lvlJc w:val="left"/>
+      <w:pPr>
+        <w:ind w:left="2880" w:hanging="360"/>
+      </w:pPr>
+      <w:rPr>
+        <w:u w:val="none"/>
+      </w:rPr>
+    </w:lvl>
+    <w:lvl w:ilvl="4">
+      <w:start w:val="1"/>
+      <w:numFmt w:val="bullet"/>
+      <w:lvlText w:val="○"/>
+      <w:lvlJc w:val="left"/>
+      <w:pPr>
+        <w:ind w:left="3600" w:hanging="360"/>
+      </w:pPr>
+      <w:rPr>
+        <w:u w:val="none"/>
+      </w:rPr>
+    </w:lvl>
+    <w:lvl w:ilvl="5">
+      <w:start w:val="1"/>
+      <w:numFmt w:val="bullet"/>
+      <w:lvlText w:val="■"/>
+      <w:lvlJc w:val="left"/>
+      <w:pPr>
+        <w:ind w:left="4320" w:hanging="360"/>
+      </w:pPr>
+      <w:rPr>
+        <w:u w:val="none"/>
+      </w:rPr>
+    </w:lvl>
+    <w:lvl w:ilvl="6">
+      <w:start w:val="1"/>
+      <w:numFmt w:val="bullet"/>
+      <w:lvlText w:val="●"/>
+      <w:lvlJc w:val="left"/>
+      <w:pPr>
+        <w:ind w:left="5040" w:hanging="360"/>
+      </w:pPr>
+      <w:rPr>
+        <w:u w:val="none"/>
+      </w:rPr>
+    </w:lvl>
+    <w:lvl w:ilvl="7">
+      <w:start w:val="1"/>
+      <w:numFmt w:val="bullet"/>
+      <w:lvlText w:val="○"/>
+      <w:lvlJc w:val="left"/>
+      <w:pPr>
+        <w:ind w:left="5760" w:hanging="360"/>
+      </w:pPr>
+      <w:rPr>
+        <w:u w:val="none"/>
+      </w:rPr>
+    </w:lvl>
+    <w:lvl w:ilvl="8">
+      <w:start w:val="1"/>
+      <w:numFmt w:val="bullet"/>
+      <w:lvlText w:val="■"/>
+      <w:lvlJc w:val="left"/>
+      <w:pPr>
+        <w:ind w:left="6480" w:hanging="360"/>
+      </w:pPr>
+      <w:rPr>
+        <w:u w:val="none"/>
+      </w:rPr>
+    </w:lvl>
+  </w:abstractNum>
+  <w:abstractNum w:abstractNumId="21">
     <w:lvl w:ilvl="0">
       <w:start w:val="1"/>
       <w:numFmt w:val="bullet"/>
@@ -6884,6 +7196,9 @@
   </w:num>
   <w:num w:numId="20">
     <w:abstractNumId w:val="20"/>
+  </w:num>
+  <w:num w:numId="21">
+    <w:abstractNumId w:val="21"/>
   </w:num>
 </w:numbering>
 </file>

</xml_diff>

<commit_message>
actualización doc modelo de datos y avance memoria del proyecto
</commit_message>
<xml_diff>
--- a/Devoluciones Presentaciones_Kairos_NexTech.docx
+++ b/Devoluciones Presentaciones_Kairos_NexTech.docx
@@ -4,6 +4,648 @@
   <w:body>
     <w:p>
       <w:pPr>
+        <w:ind w:left="720" w:firstLine="0"/>
+        <w:jc w:val="both"/>
+        <w:rPr/>
+      </w:pPr>
+      <w:r>
+        <w:rPr>
+          <w:rtl w:val="0"/>
+        </w:rPr>
+        <w:t xml:space="preserve">28/11/2025 Defensa del proyecto</w:t>
+      </w:r>
+    </w:p>
+    <w:p>
+      <w:pPr>
+        <w:ind w:left="0" w:firstLine="0"/>
+        <w:jc w:val="both"/>
+        <w:rPr/>
+      </w:pPr>
+      <w:r>
+        <w:rPr>
+          <w:rtl w:val="0"/>
+        </w:rPr>
+      </w:r>
+    </w:p>
+    <w:p>
+      <w:pPr>
+        <w:numPr>
+          <w:ilvl w:val="0"/>
+          <w:numId w:val="8"/>
+        </w:numPr>
+        <w:ind w:left="1440" w:hanging="360"/>
+        <w:jc w:val="both"/>
+        <w:rPr>
+          <w:u w:val="none"/>
+        </w:rPr>
+      </w:pPr>
+      <w:r>
+        <w:rPr>
+          <w:rtl w:val="0"/>
+        </w:rPr>
+        <w:t xml:space="preserve">Nos estaría faltando que mientras ellos van viendo las estadísticas de cada uno de los temas, que expliquemos una interpretación de los números que obtuvimos como resultado. Por ejemplo, de los riesgos no comentamos nada del estilo “se materializó tal riesgo”, “Tal riesgo nos preocupó”</w:t>
+      </w:r>
+    </w:p>
+    <w:p>
+      <w:pPr>
+        <w:numPr>
+          <w:ilvl w:val="0"/>
+          <w:numId w:val="8"/>
+        </w:numPr>
+        <w:ind w:left="1440" w:hanging="360"/>
+        <w:jc w:val="both"/>
+        <w:rPr>
+          <w:u w:val="none"/>
+        </w:rPr>
+      </w:pPr>
+      <w:r>
+        <w:rPr>
+          <w:rtl w:val="0"/>
+        </w:rPr>
+        <w:t xml:space="preserve">No especificamos cómo o por qué tomamos ciertas decisiones, qué problemas tuvimos, cómo los solucionamos (por ejemplo, logos o nombre del proyecto). Hace falta interpretaciones de cosas.</w:t>
+      </w:r>
+    </w:p>
+    <w:p>
+      <w:pPr>
+        <w:numPr>
+          <w:ilvl w:val="0"/>
+          <w:numId w:val="8"/>
+        </w:numPr>
+        <w:ind w:left="1440" w:hanging="360"/>
+        <w:jc w:val="both"/>
+        <w:rPr>
+          <w:u w:val="none"/>
+        </w:rPr>
+      </w:pPr>
+      <w:r>
+        <w:rPr>
+          <w:rtl w:val="0"/>
+        </w:rPr>
+        <w:t xml:space="preserve">No mencionamos por qué sucedió que desarrollamos casos de uso extra en una iteración que no habíamos planificado.</w:t>
+      </w:r>
+    </w:p>
+    <w:p>
+      <w:pPr>
+        <w:numPr>
+          <w:ilvl w:val="0"/>
+          <w:numId w:val="8"/>
+        </w:numPr>
+        <w:ind w:left="1440" w:hanging="360"/>
+        <w:jc w:val="both"/>
+        <w:rPr>
+          <w:u w:val="none"/>
+        </w:rPr>
+      </w:pPr>
+      <w:r>
+        <w:rPr>
+          <w:rtl w:val="0"/>
+        </w:rPr>
+        <w:t xml:space="preserve">Lo que les interesaba saber es si la gestión que aplicamos nos sirvió para algo.</w:t>
+      </w:r>
+    </w:p>
+    <w:p>
+      <w:pPr>
+        <w:numPr>
+          <w:ilvl w:val="0"/>
+          <w:numId w:val="8"/>
+        </w:numPr>
+        <w:ind w:left="1440" w:hanging="360"/>
+        <w:jc w:val="both"/>
+        <w:rPr>
+          <w:u w:val="none"/>
+        </w:rPr>
+      </w:pPr>
+      <w:r>
+        <w:rPr>
+          <w:rtl w:val="0"/>
+        </w:rPr>
+        <w:t xml:space="preserve">NexTech alias Acentos.</w:t>
+      </w:r>
+    </w:p>
+    <w:p>
+      <w:pPr>
+        <w:numPr>
+          <w:ilvl w:val="0"/>
+          <w:numId w:val="8"/>
+        </w:numPr>
+        <w:ind w:left="1440" w:hanging="360"/>
+        <w:jc w:val="both"/>
+        <w:rPr>
+          <w:u w:val="none"/>
+        </w:rPr>
+      </w:pPr>
+      <w:r>
+        <w:rPr>
+          <w:rtl w:val="0"/>
+        </w:rPr>
+        <w:t xml:space="preserve">Debemos mostrar los problemas que tuvimos desde el punto de vista del aprendizaje. Qué problemas tuvimos, cómo los solucionamos, en qué repercutió, qué no tuvimos en cuenta, etc. Quieren que describamos un poco cómo fue el transitar por la materia.</w:t>
+      </w:r>
+    </w:p>
+    <w:p>
+      <w:pPr>
+        <w:numPr>
+          <w:ilvl w:val="0"/>
+          <w:numId w:val="8"/>
+        </w:numPr>
+        <w:ind w:left="1440" w:hanging="360"/>
+        <w:jc w:val="both"/>
+        <w:rPr>
+          <w:u w:val="none"/>
+        </w:rPr>
+      </w:pPr>
+      <w:r>
+        <w:rPr>
+          <w:rtl w:val="0"/>
+        </w:rPr>
+        <w:t xml:space="preserve">Gustó el gráfico de la evolución de los riesgos. De todas formas estaría bueno analizar lo que representan los datos en conjunto.</w:t>
+      </w:r>
+    </w:p>
+    <w:p>
+      <w:pPr>
+        <w:numPr>
+          <w:ilvl w:val="0"/>
+          <w:numId w:val="8"/>
+        </w:numPr>
+        <w:ind w:left="1440" w:hanging="360"/>
+        <w:jc w:val="both"/>
+        <w:rPr>
+          <w:u w:val="none"/>
+        </w:rPr>
+      </w:pPr>
+      <w:r>
+        <w:rPr>
+          <w:rtl w:val="0"/>
+        </w:rPr>
+        <w:t xml:space="preserve">Enumeramos muchas cosas de las que hicimos, que no dice mucho.</w:t>
+      </w:r>
+    </w:p>
+    <w:p>
+      <w:pPr>
+        <w:numPr>
+          <w:ilvl w:val="0"/>
+          <w:numId w:val="8"/>
+        </w:numPr>
+        <w:ind w:left="1440" w:hanging="360"/>
+        <w:jc w:val="both"/>
+        <w:rPr>
+          <w:u w:val="none"/>
+        </w:rPr>
+      </w:pPr>
+      <w:r>
+        <w:rPr>
+          <w:rtl w:val="0"/>
+        </w:rPr>
+        <w:t xml:space="preserve">Le hubiese gustado a Karim que las chicas destaquen mas. Quiere que contemos qué situaciones podemos destacar, que herramientas nos dieron, qué trabajamos como equipo para solucionar los problemas. Esto debería agregarse a la memoria del proyecto.</w:t>
+      </w:r>
+    </w:p>
+    <w:p>
+      <w:pPr>
+        <w:numPr>
+          <w:ilvl w:val="0"/>
+          <w:numId w:val="8"/>
+        </w:numPr>
+        <w:ind w:left="1440" w:hanging="360"/>
+        <w:jc w:val="both"/>
+        <w:rPr>
+          <w:u w:val="none"/>
+        </w:rPr>
+      </w:pPr>
+      <w:r>
+        <w:rPr>
+          <w:rtl w:val="0"/>
+        </w:rPr>
+        <w:t xml:space="preserve">No queda muy claro si nos sirvieron o no las tareas de gestión inicial, agregar a la memoria y presentación</w:t>
+      </w:r>
+    </w:p>
+    <w:p>
+      <w:pPr>
+        <w:numPr>
+          <w:ilvl w:val="0"/>
+          <w:numId w:val="8"/>
+        </w:numPr>
+        <w:ind w:left="1440" w:hanging="360"/>
+        <w:jc w:val="both"/>
+        <w:rPr>
+          <w:u w:val="none"/>
+        </w:rPr>
+      </w:pPr>
+      <w:r>
+        <w:rPr>
+          <w:rtl w:val="0"/>
+        </w:rPr>
+        <w:t xml:space="preserve">Cómo nos organizábamos en la toma de decisiones.</w:t>
+      </w:r>
+    </w:p>
+    <w:p>
+      <w:pPr>
+        <w:numPr>
+          <w:ilvl w:val="0"/>
+          <w:numId w:val="8"/>
+        </w:numPr>
+        <w:ind w:left="1440" w:hanging="360"/>
+        <w:jc w:val="both"/>
+        <w:rPr>
+          <w:u w:val="none"/>
+        </w:rPr>
+      </w:pPr>
+      <w:r>
+        <w:rPr>
+          <w:rtl w:val="0"/>
+        </w:rPr>
+        <w:t xml:space="preserve">Contar para qué utilizamos las ramas extra que tenemos.</w:t>
+      </w:r>
+    </w:p>
+    <w:p>
+      <w:pPr>
+        <w:numPr>
+          <w:ilvl w:val="0"/>
+          <w:numId w:val="8"/>
+        </w:numPr>
+        <w:ind w:left="1440" w:hanging="360"/>
+        <w:jc w:val="both"/>
+        <w:rPr>
+          <w:u w:val="none"/>
+        </w:rPr>
+      </w:pPr>
+      <w:r>
+        <w:rPr>
+          <w:rtl w:val="0"/>
+        </w:rPr>
+        <w:t xml:space="preserve">Distribuir mejor la carga de lo que hablamos.</w:t>
+      </w:r>
+    </w:p>
+    <w:p>
+      <w:pPr>
+        <w:numPr>
+          <w:ilvl w:val="0"/>
+          <w:numId w:val="8"/>
+        </w:numPr>
+        <w:ind w:left="1440" w:hanging="360"/>
+        <w:jc w:val="both"/>
+        <w:rPr>
+          <w:u w:val="none"/>
+        </w:rPr>
+      </w:pPr>
+      <w:r>
+        <w:rPr>
+          <w:rtl w:val="0"/>
+        </w:rPr>
+        <w:t xml:space="preserve">Al video le falta mostrar algunos casos de uso. En el tinal podemos hacer un video más largo y darnos un poco más de tiempo para explicarlo.</w:t>
+      </w:r>
+    </w:p>
+    <w:p>
+      <w:pPr>
+        <w:numPr>
+          <w:ilvl w:val="0"/>
+          <w:numId w:val="8"/>
+        </w:numPr>
+        <w:ind w:left="1440" w:hanging="360"/>
+        <w:jc w:val="both"/>
+        <w:rPr>
+          <w:u w:val="none"/>
+        </w:rPr>
+      </w:pPr>
+      <w:r>
+        <w:rPr>
+          <w:rtl w:val="0"/>
+        </w:rPr>
+        <w:t xml:space="preserve">Para el final debe mostrarse un video que muestre cómo el software soluciona el problema por el cual inicia el proyecto, además de mostrar las funcionalidades.</w:t>
+      </w:r>
+    </w:p>
+    <w:p>
+      <w:pPr>
+        <w:numPr>
+          <w:ilvl w:val="0"/>
+          <w:numId w:val="8"/>
+        </w:numPr>
+        <w:ind w:left="1440" w:hanging="360"/>
+        <w:jc w:val="both"/>
+        <w:rPr>
+          <w:u w:val="none"/>
+        </w:rPr>
+      </w:pPr>
+      <w:r>
+        <w:rPr>
+          <w:rtl w:val="0"/>
+        </w:rPr>
+        <w:t xml:space="preserve">En la presentación no habían algunos de los gráficos que sí teníamos en el sistema de kairos.</w:t>
+      </w:r>
+    </w:p>
+    <w:p>
+      <w:pPr>
+        <w:numPr>
+          <w:ilvl w:val="0"/>
+          <w:numId w:val="8"/>
+        </w:numPr>
+        <w:ind w:left="1440" w:hanging="360"/>
+        <w:jc w:val="both"/>
+        <w:rPr>
+          <w:u w:val="none"/>
+        </w:rPr>
+      </w:pPr>
+      <w:r>
+        <w:rPr>
+          <w:rtl w:val="0"/>
+        </w:rPr>
+        <w:t xml:space="preserve">Estaría bueno que para las iteraciones en las que recién habíamos comenzado con la codificación (elaboración 2 ponele), reemplacemos el valor que habíamos utilizado para la estimación por el valor que tenemos de velocidad del equipo para ver cómo daría si la estimación que hicimos en septiembre tuviera valores más asentados del equipo. Estaría bueno en la memoria (o en la presentación final creo no se), para ver si sirve hacer la estimación.</w:t>
+      </w:r>
+    </w:p>
+    <w:p>
+      <w:pPr>
+        <w:numPr>
+          <w:ilvl w:val="0"/>
+          <w:numId w:val="8"/>
+        </w:numPr>
+        <w:ind w:left="1440" w:hanging="360"/>
+        <w:jc w:val="both"/>
+        <w:rPr>
+          <w:u w:val="none"/>
+        </w:rPr>
+      </w:pPr>
+      <w:r>
+        <w:rPr>
+          <w:rtl w:val="0"/>
+        </w:rPr>
+      </w:r>
+    </w:p>
+    <w:p>
+      <w:pPr>
+        <w:ind w:left="720" w:firstLine="0"/>
+        <w:jc w:val="both"/>
+        <w:rPr/>
+      </w:pPr>
+      <w:r>
+        <w:rPr>
+          <w:rtl w:val="0"/>
+        </w:rPr>
+      </w:r>
+    </w:p>
+    <w:p>
+      <w:pPr>
+        <w:ind w:left="720" w:firstLine="0"/>
+        <w:jc w:val="both"/>
+        <w:rPr/>
+      </w:pPr>
+      <w:r>
+        <w:rPr>
+          <w:rtl w:val="0"/>
+        </w:rPr>
+      </w:r>
+    </w:p>
+    <w:p>
+      <w:pPr>
+        <w:numPr>
+          <w:ilvl w:val="0"/>
+          <w:numId w:val="23"/>
+        </w:numPr>
+        <w:ind w:left="720" w:hanging="360"/>
+        <w:jc w:val="both"/>
+        <w:rPr/>
+      </w:pPr>
+      <w:r>
+        <w:rPr>
+          <w:rtl w:val="0"/>
+        </w:rPr>
+        <w:t xml:space="preserve">E</w:t>
+      </w:r>
+      <w:r>
+        <w:rPr>
+          <w:rtl w:val="0"/>
+        </w:rPr>
+        <w:t xml:space="preserve">n el software faltan acentos en varios lugares, especialmente en el dashboard.</w:t>
+      </w:r>
+    </w:p>
+    <w:p>
+      <w:pPr>
+        <w:numPr>
+          <w:ilvl w:val="0"/>
+          <w:numId w:val="23"/>
+        </w:numPr>
+        <w:ind w:left="720" w:hanging="360"/>
+        <w:jc w:val="both"/>
+        <w:rPr/>
+      </w:pPr>
+      <w:r>
+        <w:rPr>
+          <w:rtl w:val="0"/>
+        </w:rPr>
+        <w:t xml:space="preserve">Para la defensa del proyecto tenemos que poner nuestros datos reales en nuestro sistema y aprovecharnos de los gráficos.</w:t>
+      </w:r>
+    </w:p>
+    <w:p>
+      <w:pPr>
+        <w:numPr>
+          <w:ilvl w:val="0"/>
+          <w:numId w:val="23"/>
+        </w:numPr>
+        <w:ind w:left="720" w:hanging="360"/>
+        <w:jc w:val="both"/>
+        <w:rPr/>
+      </w:pPr>
+      <w:r>
+        <w:rPr>
+          <w:rtl w:val="0"/>
+        </w:rPr>
+        <w:t xml:space="preserve">Si realmente rendimos en abril/mayo, no es necesario hacer una reunión de avances, con la reunión previa al final sería suficiente.</w:t>
+      </w:r>
+    </w:p>
+    <w:p>
+      <w:pPr>
+        <w:numPr>
+          <w:ilvl w:val="0"/>
+          <w:numId w:val="23"/>
+        </w:numPr>
+        <w:ind w:left="720" w:hanging="360"/>
+        <w:jc w:val="both"/>
+        <w:rPr/>
+      </w:pPr>
+      <w:r>
+        <w:rPr>
+          <w:rtl w:val="0"/>
+        </w:rPr>
+        <w:t xml:space="preserve">La cantidad de integrales del proyecto la limitamos a 6 y es una decisión que tomamos en base a nada, es decir, el cliente no lo pidió y es algo importante. Es una restricción que no se puede establecer en así nomás, debe ser planteado y acordado.</w:t>
+      </w:r>
+    </w:p>
+    <w:p>
+      <w:pPr>
+        <w:numPr>
+          <w:ilvl w:val="0"/>
+          <w:numId w:val="23"/>
+        </w:numPr>
+        <w:ind w:left="720" w:hanging="360"/>
+        <w:jc w:val="both"/>
+        <w:rPr/>
+      </w:pPr>
+      <w:r>
+        <w:rPr>
+          <w:rtl w:val="0"/>
+        </w:rPr>
+        <w:t xml:space="preserve">Toda la parte de organización y gestión del proyecto no se trata de juntar todo como lo teníamos, implica hacer un resumen de cómo nos fue en las planificaciones, el análisis de lo que ocurrió. No copiar y pegar. Por ejemplo, las pruebas que no terminamos de una iteración no los planificamos para la iteración siguiente, lo que está mal.</w:t>
+      </w:r>
+    </w:p>
+    <w:p>
+      <w:pPr>
+        <w:numPr>
+          <w:ilvl w:val="0"/>
+          <w:numId w:val="23"/>
+        </w:numPr>
+        <w:ind w:left="720" w:hanging="360"/>
+        <w:jc w:val="both"/>
+        <w:rPr>
+          <w:u w:val="none"/>
+        </w:rPr>
+      </w:pPr>
+      <w:r>
+        <w:rPr>
+          <w:rtl w:val="0"/>
+        </w:rPr>
+        <w:t xml:space="preserve">Cuando mostramos las pruebas mostrar la cantidad de errores por tipo de prueba.</w:t>
+      </w:r>
+    </w:p>
+    <w:p>
+      <w:pPr>
+        <w:numPr>
+          <w:ilvl w:val="0"/>
+          <w:numId w:val="23"/>
+        </w:numPr>
+        <w:ind w:left="720" w:hanging="360"/>
+        <w:jc w:val="both"/>
+        <w:rPr>
+          <w:u w:val="none"/>
+        </w:rPr>
+      </w:pPr>
+      <w:r>
+        <w:rPr>
+          <w:rtl w:val="0"/>
+        </w:rPr>
+        <w:t xml:space="preserve">Para el manual de usuario:encontrar la forma de mostrar todas las funcionalidades como para que el usuario sea práctico y tenga una guía clara de cómo trabajar. Cuando pones varias funcionalidades en el mismo video se puede tornar confuso. separa el video en partes en vez de poner todo junto. Además estaría bueno que se acompañe con algo de documentación de todas formas (no a modo de tutorial, sino de descripción). Se me ocurre poner los videos por pantalla y acompañar con un párrafo descriptivo de la pantalla.</w:t>
+      </w:r>
+    </w:p>
+    <w:p>
+      <w:pPr>
+        <w:numPr>
+          <w:ilvl w:val="0"/>
+          <w:numId w:val="23"/>
+        </w:numPr>
+        <w:ind w:left="720" w:hanging="360"/>
+        <w:jc w:val="both"/>
+        <w:rPr>
+          <w:u w:val="none"/>
+        </w:rPr>
+      </w:pPr>
+      <w:r>
+        <w:rPr>
+          <w:rtl w:val="0"/>
+        </w:rPr>
+        <w:t xml:space="preserve">Informe: debe quedar más visible y claro la iteración (con su fecha, que es igual de importante) las fechas de generación del reporte.</w:t>
+      </w:r>
+    </w:p>
+    <w:p>
+      <w:pPr>
+        <w:numPr>
+          <w:ilvl w:val="0"/>
+          <w:numId w:val="23"/>
+        </w:numPr>
+        <w:ind w:left="720" w:hanging="360"/>
+        <w:jc w:val="both"/>
+        <w:rPr>
+          <w:u w:val="none"/>
+        </w:rPr>
+      </w:pPr>
+      <w:r>
+        <w:rPr>
+          <w:rtl w:val="0"/>
+        </w:rPr>
+        <w:t xml:space="preserve">Instalación,manual de usuario y memoria: incorporar la numeración de títulos y subtítulos (en las plantillas psi falta).</w:t>
+      </w:r>
+    </w:p>
+    <w:p>
+      <w:pPr>
+        <w:numPr>
+          <w:ilvl w:val="0"/>
+          <w:numId w:val="23"/>
+        </w:numPr>
+        <w:ind w:left="720" w:hanging="360"/>
+        <w:jc w:val="both"/>
+        <w:rPr>
+          <w:u w:val="none"/>
+        </w:rPr>
+      </w:pPr>
+      <w:r>
+        <w:rPr>
+          <w:rtl w:val="0"/>
+        </w:rPr>
+        <w:t xml:space="preserve">Recomiendan que al terminar el manual de instalación, pedirle a un random que instale el software.</w:t>
+      </w:r>
+    </w:p>
+    <w:p>
+      <w:pPr>
+        <w:numPr>
+          <w:ilvl w:val="0"/>
+          <w:numId w:val="23"/>
+        </w:numPr>
+        <w:ind w:left="720" w:hanging="360"/>
+        <w:jc w:val="both"/>
+        <w:rPr>
+          <w:u w:val="none"/>
+        </w:rPr>
+      </w:pPr>
+      <w:r>
+        <w:rPr>
+          <w:rtl w:val="0"/>
+        </w:rPr>
+        <w:t xml:space="preserve">En el manual del usuario: no describir menúes, lo que tienen los menúes sin explicar.</w:t>
+      </w:r>
+    </w:p>
+    <w:p>
+      <w:pPr>
+        <w:numPr>
+          <w:ilvl w:val="0"/>
+          <w:numId w:val="23"/>
+        </w:numPr>
+        <w:ind w:left="720" w:hanging="360"/>
+        <w:jc w:val="both"/>
+        <w:rPr>
+          <w:u w:val="none"/>
+        </w:rPr>
+      </w:pPr>
+      <w:r>
+        <w:rPr>
+          <w:rtl w:val="0"/>
+        </w:rPr>
+        <w:t xml:space="preserve">Viernes: reconto de lo que venimos viendo en toda la materia, en todo lo que se hizo. Resumen estadístico, teniendo en cuenta una idea de lo que sería la memoria. Contar las cosas. El software podemos presentarlo en vivo o hacer un video solo de las cosas importantes. Evitar detallar abms.</w:t>
+      </w:r>
+    </w:p>
+    <w:p>
+      <w:pPr>
+        <w:jc w:val="left"/>
+        <w:rPr>
+          <w:sz w:val="38"/>
+          <w:szCs w:val="38"/>
+        </w:rPr>
+      </w:pPr>
+      <w:r>
+        <w:rPr>
+          <w:rtl w:val="0"/>
+        </w:rPr>
+      </w:r>
+    </w:p>
+    <w:p>
+      <w:pPr>
+        <w:jc w:val="center"/>
+        <w:rPr>
+          <w:sz w:val="38"/>
+          <w:szCs w:val="38"/>
+        </w:rPr>
+      </w:pPr>
+      <w:r>
+        <w:rPr>
+          <w:rtl w:val="0"/>
+        </w:rPr>
+      </w:r>
+    </w:p>
+    <w:p>
+      <w:pPr>
         <w:jc w:val="center"/>
         <w:rPr/>
       </w:pPr>
@@ -60,7 +702,7 @@
       <w:pPr>
         <w:numPr>
           <w:ilvl w:val="0"/>
-          <w:numId w:val="21"/>
+          <w:numId w:val="22"/>
         </w:numPr>
         <w:ind w:left="720" w:hanging="360"/>
         <w:jc w:val="left"/>
@@ -91,7 +733,7 @@
       <w:pPr>
         <w:numPr>
           <w:ilvl w:val="0"/>
-          <w:numId w:val="21"/>
+          <w:numId w:val="22"/>
         </w:numPr>
         <w:ind w:left="720" w:hanging="360"/>
         <w:jc w:val="left"/>
@@ -122,7 +764,7 @@
       <w:pPr>
         <w:numPr>
           <w:ilvl w:val="0"/>
-          <w:numId w:val="21"/>
+          <w:numId w:val="22"/>
         </w:numPr>
         <w:ind w:left="720" w:hanging="360"/>
         <w:jc w:val="left"/>
@@ -229,7 +871,7 @@
       <w:pPr>
         <w:numPr>
           <w:ilvl w:val="0"/>
-          <w:numId w:val="9"/>
+          <w:numId w:val="10"/>
         </w:numPr>
         <w:ind w:left="720" w:hanging="360"/>
         <w:jc w:val="both"/>
@@ -248,7 +890,7 @@
       <w:pPr>
         <w:numPr>
           <w:ilvl w:val="0"/>
-          <w:numId w:val="9"/>
+          <w:numId w:val="10"/>
         </w:numPr>
         <w:ind w:left="720" w:hanging="360"/>
         <w:jc w:val="both"/>
@@ -279,7 +921,7 @@
       <w:pPr>
         <w:numPr>
           <w:ilvl w:val="0"/>
-          <w:numId w:val="9"/>
+          <w:numId w:val="10"/>
         </w:numPr>
         <w:ind w:left="720" w:hanging="360"/>
         <w:jc w:val="both"/>
@@ -310,7 +952,7 @@
       <w:pPr>
         <w:numPr>
           <w:ilvl w:val="0"/>
-          <w:numId w:val="9"/>
+          <w:numId w:val="10"/>
         </w:numPr>
         <w:ind w:left="720" w:hanging="360"/>
         <w:jc w:val="both"/>
@@ -341,7 +983,7 @@
       <w:pPr>
         <w:numPr>
           <w:ilvl w:val="0"/>
-          <w:numId w:val="9"/>
+          <w:numId w:val="10"/>
         </w:numPr>
         <w:ind w:left="720" w:hanging="360"/>
         <w:jc w:val="both"/>
@@ -437,7 +1079,7 @@
       <w:pPr>
         <w:numPr>
           <w:ilvl w:val="0"/>
-          <w:numId w:val="20"/>
+          <w:numId w:val="21"/>
         </w:numPr>
         <w:ind w:left="720" w:hanging="360"/>
         <w:jc w:val="both"/>
@@ -468,7 +1110,7 @@
       <w:pPr>
         <w:numPr>
           <w:ilvl w:val="0"/>
-          <w:numId w:val="20"/>
+          <w:numId w:val="21"/>
         </w:numPr>
         <w:ind w:left="720" w:hanging="360"/>
         <w:jc w:val="both"/>
@@ -899,7 +1541,7 @@
       <w:pPr>
         <w:numPr>
           <w:ilvl w:val="0"/>
-          <w:numId w:val="15"/>
+          <w:numId w:val="16"/>
         </w:numPr>
         <w:ind w:left="720" w:hanging="360"/>
         <w:jc w:val="both"/>
@@ -930,7 +1572,7 @@
       <w:pPr>
         <w:numPr>
           <w:ilvl w:val="0"/>
-          <w:numId w:val="15"/>
+          <w:numId w:val="16"/>
         </w:numPr>
         <w:ind w:left="720" w:hanging="360"/>
         <w:jc w:val="both"/>
@@ -961,7 +1603,7 @@
       <w:pPr>
         <w:numPr>
           <w:ilvl w:val="0"/>
-          <w:numId w:val="15"/>
+          <w:numId w:val="16"/>
         </w:numPr>
         <w:ind w:left="720" w:hanging="360"/>
         <w:jc w:val="both"/>
@@ -992,7 +1634,7 @@
       <w:pPr>
         <w:numPr>
           <w:ilvl w:val="0"/>
-          <w:numId w:val="15"/>
+          <w:numId w:val="16"/>
         </w:numPr>
         <w:ind w:left="720" w:hanging="360"/>
         <w:jc w:val="both"/>
@@ -1023,7 +1665,7 @@
       <w:pPr>
         <w:numPr>
           <w:ilvl w:val="0"/>
-          <w:numId w:val="15"/>
+          <w:numId w:val="16"/>
         </w:numPr>
         <w:ind w:left="720" w:hanging="360"/>
         <w:jc w:val="both"/>
@@ -1138,7 +1780,7 @@
       <w:pPr>
         <w:numPr>
           <w:ilvl w:val="0"/>
-          <w:numId w:val="17"/>
+          <w:numId w:val="18"/>
         </w:numPr>
         <w:ind w:left="1440" w:hanging="360"/>
         <w:jc w:val="both"/>
@@ -1157,7 +1799,7 @@
       <w:pPr>
         <w:numPr>
           <w:ilvl w:val="0"/>
-          <w:numId w:val="17"/>
+          <w:numId w:val="18"/>
         </w:numPr>
         <w:ind w:left="1440" w:hanging="360"/>
         <w:jc w:val="both"/>
@@ -1176,7 +1818,7 @@
       <w:pPr>
         <w:numPr>
           <w:ilvl w:val="0"/>
-          <w:numId w:val="17"/>
+          <w:numId w:val="18"/>
         </w:numPr>
         <w:ind w:left="1440" w:hanging="360"/>
         <w:jc w:val="both"/>
@@ -1207,7 +1849,7 @@
       <w:pPr>
         <w:numPr>
           <w:ilvl w:val="0"/>
-          <w:numId w:val="13"/>
+          <w:numId w:val="14"/>
         </w:numPr>
         <w:ind w:left="720" w:hanging="360"/>
         <w:jc w:val="both"/>
@@ -1238,7 +1880,7 @@
       <w:pPr>
         <w:numPr>
           <w:ilvl w:val="0"/>
-          <w:numId w:val="13"/>
+          <w:numId w:val="14"/>
         </w:numPr>
         <w:ind w:left="720" w:hanging="360"/>
         <w:jc w:val="both"/>
@@ -1269,7 +1911,7 @@
       <w:pPr>
         <w:numPr>
           <w:ilvl w:val="0"/>
-          <w:numId w:val="13"/>
+          <w:numId w:val="14"/>
         </w:numPr>
         <w:ind w:left="720" w:hanging="360"/>
         <w:jc w:val="both"/>
@@ -1300,7 +1942,7 @@
       <w:pPr>
         <w:numPr>
           <w:ilvl w:val="0"/>
-          <w:numId w:val="13"/>
+          <w:numId w:val="14"/>
         </w:numPr>
         <w:ind w:left="720" w:hanging="360"/>
         <w:jc w:val="both"/>
@@ -1331,7 +1973,7 @@
       <w:pPr>
         <w:numPr>
           <w:ilvl w:val="0"/>
-          <w:numId w:val="13"/>
+          <w:numId w:val="14"/>
         </w:numPr>
         <w:ind w:left="720" w:hanging="360"/>
         <w:jc w:val="both"/>
@@ -1388,7 +2030,7 @@
       <w:pPr>
         <w:numPr>
           <w:ilvl w:val="0"/>
-          <w:numId w:val="13"/>
+          <w:numId w:val="14"/>
         </w:numPr>
         <w:ind w:left="720" w:hanging="360"/>
         <w:jc w:val="both"/>
@@ -1419,7 +2061,7 @@
       <w:pPr>
         <w:numPr>
           <w:ilvl w:val="0"/>
-          <w:numId w:val="13"/>
+          <w:numId w:val="14"/>
         </w:numPr>
         <w:ind w:left="720" w:hanging="360"/>
         <w:jc w:val="both"/>
@@ -1450,7 +2092,7 @@
       <w:pPr>
         <w:numPr>
           <w:ilvl w:val="0"/>
-          <w:numId w:val="13"/>
+          <w:numId w:val="14"/>
         </w:numPr>
         <w:ind w:left="720" w:hanging="360"/>
         <w:jc w:val="both"/>
@@ -1481,7 +2123,7 @@
       <w:pPr>
         <w:numPr>
           <w:ilvl w:val="0"/>
-          <w:numId w:val="13"/>
+          <w:numId w:val="14"/>
         </w:numPr>
         <w:ind w:left="720" w:hanging="360"/>
         <w:jc w:val="both"/>
@@ -1565,7 +2207,7 @@
       <w:pPr>
         <w:numPr>
           <w:ilvl w:val="0"/>
-          <w:numId w:val="14"/>
+          <w:numId w:val="15"/>
         </w:numPr>
         <w:ind w:left="720" w:hanging="360"/>
         <w:jc w:val="both"/>
@@ -1596,7 +2238,7 @@
       <w:pPr>
         <w:numPr>
           <w:ilvl w:val="0"/>
-          <w:numId w:val="14"/>
+          <w:numId w:val="15"/>
         </w:numPr>
         <w:ind w:left="720" w:hanging="360"/>
         <w:jc w:val="both"/>
@@ -1627,7 +2269,7 @@
       <w:pPr>
         <w:numPr>
           <w:ilvl w:val="0"/>
-          <w:numId w:val="14"/>
+          <w:numId w:val="15"/>
         </w:numPr>
         <w:ind w:left="720" w:hanging="360"/>
         <w:jc w:val="both"/>
@@ -1658,7 +2300,7 @@
       <w:pPr>
         <w:numPr>
           <w:ilvl w:val="0"/>
-          <w:numId w:val="14"/>
+          <w:numId w:val="15"/>
         </w:numPr>
         <w:ind w:left="720" w:hanging="360"/>
         <w:jc w:val="both"/>
@@ -1689,7 +2331,7 @@
       <w:pPr>
         <w:numPr>
           <w:ilvl w:val="0"/>
-          <w:numId w:val="14"/>
+          <w:numId w:val="15"/>
         </w:numPr>
         <w:ind w:left="720" w:hanging="360"/>
         <w:jc w:val="both"/>
@@ -1720,7 +2362,7 @@
       <w:pPr>
         <w:numPr>
           <w:ilvl w:val="0"/>
-          <w:numId w:val="14"/>
+          <w:numId w:val="15"/>
         </w:numPr>
         <w:ind w:left="720" w:hanging="360"/>
         <w:jc w:val="both"/>
@@ -1751,7 +2393,7 @@
       <w:pPr>
         <w:numPr>
           <w:ilvl w:val="0"/>
-          <w:numId w:val="14"/>
+          <w:numId w:val="15"/>
         </w:numPr>
         <w:ind w:left="720" w:hanging="360"/>
         <w:jc w:val="both"/>
@@ -1782,7 +2424,7 @@
       <w:pPr>
         <w:numPr>
           <w:ilvl w:val="0"/>
-          <w:numId w:val="14"/>
+          <w:numId w:val="15"/>
         </w:numPr>
         <w:ind w:left="720" w:hanging="360"/>
         <w:jc w:val="both"/>
@@ -1813,7 +2455,7 @@
       <w:pPr>
         <w:numPr>
           <w:ilvl w:val="0"/>
-          <w:numId w:val="14"/>
+          <w:numId w:val="15"/>
         </w:numPr>
         <w:ind w:left="720" w:hanging="360"/>
         <w:jc w:val="both"/>
@@ -1907,7 +2549,7 @@
       <w:pPr>
         <w:numPr>
           <w:ilvl w:val="0"/>
-          <w:numId w:val="10"/>
+          <w:numId w:val="11"/>
         </w:numPr>
         <w:ind w:left="720" w:hanging="360"/>
         <w:jc w:val="both"/>
@@ -1938,7 +2580,7 @@
       <w:pPr>
         <w:numPr>
           <w:ilvl w:val="0"/>
-          <w:numId w:val="10"/>
+          <w:numId w:val="11"/>
         </w:numPr>
         <w:ind w:left="720" w:hanging="360"/>
         <w:jc w:val="both"/>
@@ -1969,7 +2611,7 @@
       <w:pPr>
         <w:numPr>
           <w:ilvl w:val="0"/>
-          <w:numId w:val="10"/>
+          <w:numId w:val="11"/>
         </w:numPr>
         <w:ind w:left="720" w:hanging="360"/>
         <w:jc w:val="both"/>
@@ -2000,7 +2642,7 @@
       <w:pPr>
         <w:numPr>
           <w:ilvl w:val="0"/>
-          <w:numId w:val="10"/>
+          <w:numId w:val="11"/>
         </w:numPr>
         <w:ind w:left="720" w:hanging="360"/>
         <w:jc w:val="both"/>
@@ -2031,7 +2673,7 @@
       <w:pPr>
         <w:numPr>
           <w:ilvl w:val="0"/>
-          <w:numId w:val="10"/>
+          <w:numId w:val="11"/>
         </w:numPr>
         <w:ind w:left="720" w:hanging="360"/>
         <w:jc w:val="both"/>
@@ -2854,7 +3496,7 @@
       <w:pPr>
         <w:numPr>
           <w:ilvl w:val="0"/>
-          <w:numId w:val="11"/>
+          <w:numId w:val="12"/>
         </w:numPr>
         <w:ind w:left="720" w:hanging="360"/>
         <w:jc w:val="both"/>
@@ -2885,7 +3527,7 @@
       <w:pPr>
         <w:numPr>
           <w:ilvl w:val="0"/>
-          <w:numId w:val="11"/>
+          <w:numId w:val="12"/>
         </w:numPr>
         <w:ind w:left="720" w:hanging="360"/>
         <w:jc w:val="both"/>
@@ -2916,7 +3558,7 @@
       <w:pPr>
         <w:numPr>
           <w:ilvl w:val="0"/>
-          <w:numId w:val="11"/>
+          <w:numId w:val="12"/>
         </w:numPr>
         <w:ind w:left="720" w:hanging="360"/>
         <w:jc w:val="both"/>
@@ -2947,7 +3589,7 @@
       <w:pPr>
         <w:numPr>
           <w:ilvl w:val="0"/>
-          <w:numId w:val="11"/>
+          <w:numId w:val="12"/>
         </w:numPr>
         <w:ind w:left="720" w:hanging="360"/>
         <w:jc w:val="both"/>
@@ -2978,7 +3620,7 @@
       <w:pPr>
         <w:numPr>
           <w:ilvl w:val="0"/>
-          <w:numId w:val="11"/>
+          <w:numId w:val="12"/>
         </w:numPr>
         <w:ind w:left="720" w:hanging="360"/>
         <w:jc w:val="both"/>
@@ -3009,7 +3651,7 @@
       <w:pPr>
         <w:numPr>
           <w:ilvl w:val="0"/>
-          <w:numId w:val="11"/>
+          <w:numId w:val="12"/>
         </w:numPr>
         <w:ind w:left="720" w:hanging="360"/>
         <w:jc w:val="both"/>
@@ -3040,7 +3682,7 @@
       <w:pPr>
         <w:numPr>
           <w:ilvl w:val="0"/>
-          <w:numId w:val="11"/>
+          <w:numId w:val="12"/>
         </w:numPr>
         <w:ind w:left="720" w:hanging="360"/>
         <w:jc w:val="both"/>
@@ -3071,7 +3713,7 @@
       <w:pPr>
         <w:numPr>
           <w:ilvl w:val="0"/>
-          <w:numId w:val="11"/>
+          <w:numId w:val="12"/>
         </w:numPr>
         <w:ind w:left="720" w:hanging="360"/>
         <w:jc w:val="both"/>
@@ -3102,7 +3744,7 @@
       <w:pPr>
         <w:numPr>
           <w:ilvl w:val="0"/>
-          <w:numId w:val="11"/>
+          <w:numId w:val="12"/>
         </w:numPr>
         <w:ind w:left="720" w:hanging="360"/>
         <w:jc w:val="both"/>
@@ -3186,7 +3828,7 @@
       <w:pPr>
         <w:numPr>
           <w:ilvl w:val="0"/>
-          <w:numId w:val="16"/>
+          <w:numId w:val="17"/>
         </w:numPr>
         <w:ind w:left="720" w:hanging="360"/>
         <w:jc w:val="both"/>
@@ -3217,7 +3859,7 @@
       <w:pPr>
         <w:numPr>
           <w:ilvl w:val="0"/>
-          <w:numId w:val="16"/>
+          <w:numId w:val="17"/>
         </w:numPr>
         <w:ind w:left="720" w:hanging="360"/>
         <w:jc w:val="both"/>
@@ -3248,7 +3890,7 @@
       <w:pPr>
         <w:numPr>
           <w:ilvl w:val="0"/>
-          <w:numId w:val="16"/>
+          <w:numId w:val="17"/>
         </w:numPr>
         <w:ind w:left="720" w:hanging="360"/>
         <w:jc w:val="both"/>
@@ -3279,7 +3921,7 @@
       <w:pPr>
         <w:numPr>
           <w:ilvl w:val="0"/>
-          <w:numId w:val="16"/>
+          <w:numId w:val="17"/>
         </w:numPr>
         <w:ind w:left="720" w:hanging="360"/>
         <w:jc w:val="both"/>
@@ -3310,7 +3952,7 @@
       <w:pPr>
         <w:numPr>
           <w:ilvl w:val="0"/>
-          <w:numId w:val="16"/>
+          <w:numId w:val="17"/>
         </w:numPr>
         <w:ind w:left="720" w:hanging="360"/>
         <w:jc w:val="both"/>
@@ -3341,7 +3983,7 @@
       <w:pPr>
         <w:numPr>
           <w:ilvl w:val="0"/>
-          <w:numId w:val="16"/>
+          <w:numId w:val="17"/>
         </w:numPr>
         <w:ind w:left="720" w:hanging="360"/>
         <w:jc w:val="both"/>
@@ -3372,7 +4014,7 @@
       <w:pPr>
         <w:numPr>
           <w:ilvl w:val="0"/>
-          <w:numId w:val="16"/>
+          <w:numId w:val="17"/>
         </w:numPr>
         <w:ind w:left="720" w:hanging="360"/>
         <w:jc w:val="both"/>
@@ -3403,7 +4045,7 @@
       <w:pPr>
         <w:numPr>
           <w:ilvl w:val="0"/>
-          <w:numId w:val="16"/>
+          <w:numId w:val="17"/>
         </w:numPr>
         <w:ind w:left="720" w:hanging="360"/>
         <w:jc w:val="both"/>
@@ -3434,7 +4076,7 @@
       <w:pPr>
         <w:numPr>
           <w:ilvl w:val="0"/>
-          <w:numId w:val="16"/>
+          <w:numId w:val="17"/>
         </w:numPr>
         <w:ind w:left="720" w:hanging="360"/>
         <w:jc w:val="both"/>
@@ -3465,7 +4107,7 @@
       <w:pPr>
         <w:numPr>
           <w:ilvl w:val="0"/>
-          <w:numId w:val="16"/>
+          <w:numId w:val="17"/>
         </w:numPr>
         <w:ind w:left="720" w:hanging="360"/>
         <w:jc w:val="both"/>
@@ -3496,7 +4138,7 @@
       <w:pPr>
         <w:numPr>
           <w:ilvl w:val="0"/>
-          <w:numId w:val="16"/>
+          <w:numId w:val="17"/>
         </w:numPr>
         <w:ind w:left="720" w:hanging="360"/>
         <w:jc w:val="both"/>
@@ -3527,7 +4169,7 @@
       <w:pPr>
         <w:numPr>
           <w:ilvl w:val="0"/>
-          <w:numId w:val="16"/>
+          <w:numId w:val="17"/>
         </w:numPr>
         <w:ind w:left="720" w:hanging="360"/>
         <w:jc w:val="both"/>
@@ -3558,7 +4200,7 @@
       <w:pPr>
         <w:numPr>
           <w:ilvl w:val="0"/>
-          <w:numId w:val="16"/>
+          <w:numId w:val="17"/>
         </w:numPr>
         <w:ind w:left="720" w:hanging="360"/>
         <w:jc w:val="both"/>
@@ -3589,7 +4231,7 @@
       <w:pPr>
         <w:numPr>
           <w:ilvl w:val="0"/>
-          <w:numId w:val="16"/>
+          <w:numId w:val="17"/>
         </w:numPr>
         <w:ind w:left="720" w:hanging="360"/>
         <w:jc w:val="both"/>
@@ -3620,7 +4262,7 @@
       <w:pPr>
         <w:numPr>
           <w:ilvl w:val="0"/>
-          <w:numId w:val="16"/>
+          <w:numId w:val="17"/>
         </w:numPr>
         <w:ind w:left="720" w:hanging="360"/>
         <w:jc w:val="both"/>
@@ -3651,7 +4293,7 @@
       <w:pPr>
         <w:numPr>
           <w:ilvl w:val="0"/>
-          <w:numId w:val="16"/>
+          <w:numId w:val="17"/>
         </w:numPr>
         <w:ind w:left="720" w:hanging="360"/>
         <w:jc w:val="both"/>
@@ -3736,7 +4378,7 @@
       <w:pPr>
         <w:numPr>
           <w:ilvl w:val="0"/>
-          <w:numId w:val="8"/>
+          <w:numId w:val="9"/>
         </w:numPr>
         <w:ind w:left="720" w:hanging="360"/>
         <w:jc w:val="both"/>
@@ -3767,7 +4409,7 @@
       <w:pPr>
         <w:numPr>
           <w:ilvl w:val="0"/>
-          <w:numId w:val="8"/>
+          <w:numId w:val="9"/>
         </w:numPr>
         <w:ind w:left="720" w:hanging="360"/>
         <w:jc w:val="both"/>
@@ -3798,7 +4440,7 @@
       <w:pPr>
         <w:numPr>
           <w:ilvl w:val="0"/>
-          <w:numId w:val="8"/>
+          <w:numId w:val="9"/>
         </w:numPr>
         <w:ind w:left="720" w:hanging="360"/>
         <w:jc w:val="both"/>
@@ -3829,7 +4471,7 @@
       <w:pPr>
         <w:numPr>
           <w:ilvl w:val="0"/>
-          <w:numId w:val="8"/>
+          <w:numId w:val="9"/>
         </w:numPr>
         <w:ind w:left="720" w:hanging="360"/>
         <w:jc w:val="both"/>
@@ -3860,7 +4502,7 @@
       <w:pPr>
         <w:numPr>
           <w:ilvl w:val="0"/>
-          <w:numId w:val="8"/>
+          <w:numId w:val="9"/>
         </w:numPr>
         <w:ind w:left="720" w:hanging="360"/>
         <w:jc w:val="both"/>
@@ -3891,7 +4533,7 @@
       <w:pPr>
         <w:numPr>
           <w:ilvl w:val="0"/>
-          <w:numId w:val="8"/>
+          <w:numId w:val="9"/>
         </w:numPr>
         <w:ind w:left="720" w:hanging="360"/>
         <w:jc w:val="both"/>
@@ -3976,7 +4618,7 @@
       <w:pPr>
         <w:numPr>
           <w:ilvl w:val="0"/>
-          <w:numId w:val="18"/>
+          <w:numId w:val="19"/>
         </w:numPr>
         <w:ind w:left="720" w:hanging="360"/>
         <w:jc w:val="both"/>
@@ -4007,7 +4649,7 @@
       <w:pPr>
         <w:numPr>
           <w:ilvl w:val="0"/>
-          <w:numId w:val="18"/>
+          <w:numId w:val="19"/>
         </w:numPr>
         <w:ind w:left="720" w:hanging="360"/>
         <w:jc w:val="both"/>
@@ -4038,7 +4680,7 @@
       <w:pPr>
         <w:numPr>
           <w:ilvl w:val="0"/>
-          <w:numId w:val="18"/>
+          <w:numId w:val="19"/>
         </w:numPr>
         <w:ind w:left="720" w:hanging="360"/>
         <w:jc w:val="both"/>
@@ -4069,7 +4711,7 @@
       <w:pPr>
         <w:numPr>
           <w:ilvl w:val="0"/>
-          <w:numId w:val="18"/>
+          <w:numId w:val="19"/>
         </w:numPr>
         <w:ind w:left="720" w:hanging="360"/>
         <w:jc w:val="both"/>
@@ -4100,7 +4742,7 @@
       <w:pPr>
         <w:numPr>
           <w:ilvl w:val="0"/>
-          <w:numId w:val="18"/>
+          <w:numId w:val="19"/>
         </w:numPr>
         <w:ind w:left="720" w:hanging="360"/>
         <w:jc w:val="both"/>
@@ -4131,7 +4773,7 @@
       <w:pPr>
         <w:numPr>
           <w:ilvl w:val="0"/>
-          <w:numId w:val="18"/>
+          <w:numId w:val="19"/>
         </w:numPr>
         <w:ind w:left="720" w:hanging="360"/>
         <w:jc w:val="both"/>
@@ -4162,38 +4804,38 @@
       <w:pPr>
         <w:numPr>
           <w:ilvl w:val="0"/>
-          <w:numId w:val="18"/>
-        </w:numPr>
-        <w:ind w:left="720" w:hanging="360"/>
-        <w:jc w:val="both"/>
-        <w:rPr>
-          <w:u w:val="none"/>
-        </w:rPr>
-      </w:pPr>
-      <w:r>
-        <w:rPr>
-          <w:rtl w:val="0"/>
-        </w:rPr>
-        <w:t xml:space="preserve">El modelo de dominio es una completa basura y una absoluta pérdida de tiempo y Karim me dijo que no quiere que nunca más en mi vida presente tal falta de respeto, ya que es razón de expulsión (las entidades no tienen atributos y las relaciones no son claras ya que no son indicadas por ningún tipo de flecha ni cardinalidad).</w:t>
-      </w:r>
-    </w:p>
-    <w:p>
-      <w:pPr>
-        <w:ind w:left="720" w:firstLine="0"/>
-        <w:jc w:val="both"/>
-        <w:rPr/>
-      </w:pPr>
-      <w:r>
-        <w:rPr>
-          <w:rtl w:val="0"/>
-        </w:rPr>
-      </w:r>
-    </w:p>
-    <w:p>
-      <w:pPr>
-        <w:numPr>
-          <w:ilvl w:val="0"/>
-          <w:numId w:val="18"/>
+          <w:numId w:val="19"/>
+        </w:numPr>
+        <w:ind w:left="720" w:hanging="360"/>
+        <w:jc w:val="both"/>
+        <w:rPr>
+          <w:u w:val="none"/>
+        </w:rPr>
+      </w:pPr>
+      <w:r>
+        <w:rPr>
+          <w:rtl w:val="0"/>
+        </w:rPr>
+        <w:t xml:space="preserve">El modelo de dominio es una completa basura y una absoluta pérdida de tiempo y Karim dijo que no quiere que nunca más en mi vida presente tal falta de respeto, ya que es razón de expulsión (las entidades no tienen atributos y las relaciones no son claras ya que no son indicadas por ningún tipo de flecha ni cardinalidad).</w:t>
+      </w:r>
+    </w:p>
+    <w:p>
+      <w:pPr>
+        <w:ind w:left="720" w:firstLine="0"/>
+        <w:jc w:val="both"/>
+        <w:rPr/>
+      </w:pPr>
+      <w:r>
+        <w:rPr>
+          <w:rtl w:val="0"/>
+        </w:rPr>
+      </w:r>
+    </w:p>
+    <w:p>
+      <w:pPr>
+        <w:numPr>
+          <w:ilvl w:val="0"/>
+          <w:numId w:val="19"/>
         </w:numPr>
         <w:ind w:left="720" w:hanging="360"/>
         <w:jc w:val="both"/>
@@ -4224,7 +4866,7 @@
       <w:pPr>
         <w:numPr>
           <w:ilvl w:val="0"/>
-          <w:numId w:val="18"/>
+          <w:numId w:val="19"/>
         </w:numPr>
         <w:ind w:left="720" w:hanging="360"/>
         <w:jc w:val="both"/>
@@ -4255,7 +4897,7 @@
       <w:pPr>
         <w:numPr>
           <w:ilvl w:val="0"/>
-          <w:numId w:val="18"/>
+          <w:numId w:val="19"/>
         </w:numPr>
         <w:ind w:left="720" w:hanging="360"/>
         <w:jc w:val="both"/>
@@ -4385,7 +5027,7 @@
       <w:pPr>
         <w:numPr>
           <w:ilvl w:val="0"/>
-          <w:numId w:val="19"/>
+          <w:numId w:val="20"/>
         </w:numPr>
         <w:ind w:left="720" w:hanging="360"/>
         <w:jc w:val="both"/>
@@ -4430,7 +5072,7 @@
       <w:pPr>
         <w:numPr>
           <w:ilvl w:val="0"/>
-          <w:numId w:val="19"/>
+          <w:numId w:val="20"/>
         </w:numPr>
         <w:ind w:left="720" w:hanging="360"/>
         <w:jc w:val="both"/>
@@ -4483,7 +5125,7 @@
       <w:pPr>
         <w:numPr>
           <w:ilvl w:val="0"/>
-          <w:numId w:val="19"/>
+          <w:numId w:val="20"/>
         </w:numPr>
         <w:ind w:left="720" w:hanging="360"/>
         <w:jc w:val="both"/>
@@ -4514,7 +5156,7 @@
       <w:pPr>
         <w:numPr>
           <w:ilvl w:val="0"/>
-          <w:numId w:val="19"/>
+          <w:numId w:val="20"/>
         </w:numPr>
         <w:ind w:left="720" w:hanging="360"/>
         <w:jc w:val="both"/>
@@ -4602,7 +5244,7 @@
       <w:pPr>
         <w:numPr>
           <w:ilvl w:val="0"/>
-          <w:numId w:val="19"/>
+          <w:numId w:val="20"/>
         </w:numPr>
         <w:ind w:left="720" w:hanging="360"/>
       </w:pPr>
@@ -4628,7 +5270,7 @@
       <w:pPr>
         <w:numPr>
           <w:ilvl w:val="0"/>
-          <w:numId w:val="19"/>
+          <w:numId w:val="20"/>
         </w:numPr>
         <w:ind w:left="720" w:hanging="360"/>
         <w:rPr>
@@ -4657,7 +5299,7 @@
       <w:pPr>
         <w:numPr>
           <w:ilvl w:val="0"/>
-          <w:numId w:val="19"/>
+          <w:numId w:val="20"/>
         </w:numPr>
         <w:ind w:left="720" w:hanging="360"/>
         <w:rPr>
@@ -4686,7 +5328,7 @@
       <w:pPr>
         <w:numPr>
           <w:ilvl w:val="0"/>
-          <w:numId w:val="19"/>
+          <w:numId w:val="20"/>
         </w:numPr>
         <w:ind w:left="720" w:hanging="360"/>
         <w:rPr>
@@ -4715,7 +5357,7 @@
       <w:pPr>
         <w:numPr>
           <w:ilvl w:val="0"/>
-          <w:numId w:val="19"/>
+          <w:numId w:val="20"/>
         </w:numPr>
         <w:ind w:left="720" w:hanging="360"/>
         <w:rPr>
@@ -4744,7 +5386,7 @@
       <w:pPr>
         <w:numPr>
           <w:ilvl w:val="0"/>
-          <w:numId w:val="19"/>
+          <w:numId w:val="20"/>
         </w:numPr>
         <w:ind w:left="720" w:hanging="360"/>
         <w:rPr>
@@ -4772,7 +5414,7 @@
       <w:pPr>
         <w:numPr>
           <w:ilvl w:val="0"/>
-          <w:numId w:val="12"/>
+          <w:numId w:val="13"/>
         </w:numPr>
         <w:ind w:left="720" w:hanging="360"/>
         <w:rPr>
@@ -5601,10 +6243,10 @@
     <w:lvl w:ilvl="0">
       <w:start w:val="1"/>
       <w:numFmt w:val="bullet"/>
-      <w:lvlText w:val="●"/>
-      <w:lvlJc w:val="left"/>
-      <w:pPr>
-        <w:ind w:left="720" w:hanging="360"/>
+      <w:lvlText w:val="-"/>
+      <w:lvlJc w:val="left"/>
+      <w:pPr>
+        <w:ind w:left="1440" w:hanging="360"/>
       </w:pPr>
       <w:rPr>
         <w:u w:val="none"/>
@@ -5613,10 +6255,10 @@
     <w:lvl w:ilvl="1">
       <w:start w:val="1"/>
       <w:numFmt w:val="bullet"/>
-      <w:lvlText w:val="○"/>
-      <w:lvlJc w:val="left"/>
-      <w:pPr>
-        <w:ind w:left="1440" w:hanging="360"/>
+      <w:lvlText w:val="-"/>
+      <w:lvlJc w:val="left"/>
+      <w:pPr>
+        <w:ind w:left="2160" w:hanging="360"/>
       </w:pPr>
       <w:rPr>
         <w:u w:val="none"/>
@@ -5625,10 +6267,10 @@
     <w:lvl w:ilvl="2">
       <w:start w:val="1"/>
       <w:numFmt w:val="bullet"/>
-      <w:lvlText w:val="■"/>
-      <w:lvlJc w:val="left"/>
-      <w:pPr>
-        <w:ind w:left="2160" w:hanging="360"/>
+      <w:lvlText w:val="-"/>
+      <w:lvlJc w:val="left"/>
+      <w:pPr>
+        <w:ind w:left="2880" w:hanging="360"/>
       </w:pPr>
       <w:rPr>
         <w:u w:val="none"/>
@@ -5637,10 +6279,10 @@
     <w:lvl w:ilvl="3">
       <w:start w:val="1"/>
       <w:numFmt w:val="bullet"/>
-      <w:lvlText w:val="●"/>
-      <w:lvlJc w:val="left"/>
-      <w:pPr>
-        <w:ind w:left="2880" w:hanging="360"/>
+      <w:lvlText w:val="-"/>
+      <w:lvlJc w:val="left"/>
+      <w:pPr>
+        <w:ind w:left="3600" w:hanging="360"/>
       </w:pPr>
       <w:rPr>
         <w:u w:val="none"/>
@@ -5649,10 +6291,10 @@
     <w:lvl w:ilvl="4">
       <w:start w:val="1"/>
       <w:numFmt w:val="bullet"/>
-      <w:lvlText w:val="○"/>
-      <w:lvlJc w:val="left"/>
-      <w:pPr>
-        <w:ind w:left="3600" w:hanging="360"/>
+      <w:lvlText w:val="-"/>
+      <w:lvlJc w:val="left"/>
+      <w:pPr>
+        <w:ind w:left="4320" w:hanging="360"/>
       </w:pPr>
       <w:rPr>
         <w:u w:val="none"/>
@@ -5661,10 +6303,10 @@
     <w:lvl w:ilvl="5">
       <w:start w:val="1"/>
       <w:numFmt w:val="bullet"/>
-      <w:lvlText w:val="■"/>
-      <w:lvlJc w:val="left"/>
-      <w:pPr>
-        <w:ind w:left="4320" w:hanging="360"/>
+      <w:lvlText w:val="-"/>
+      <w:lvlJc w:val="left"/>
+      <w:pPr>
+        <w:ind w:left="5040" w:hanging="360"/>
       </w:pPr>
       <w:rPr>
         <w:u w:val="none"/>
@@ -5673,10 +6315,10 @@
     <w:lvl w:ilvl="6">
       <w:start w:val="1"/>
       <w:numFmt w:val="bullet"/>
-      <w:lvlText w:val="●"/>
-      <w:lvlJc w:val="left"/>
-      <w:pPr>
-        <w:ind w:left="5040" w:hanging="360"/>
+      <w:lvlText w:val="-"/>
+      <w:lvlJc w:val="left"/>
+      <w:pPr>
+        <w:ind w:left="5760" w:hanging="360"/>
       </w:pPr>
       <w:rPr>
         <w:u w:val="none"/>
@@ -5685,10 +6327,10 @@
     <w:lvl w:ilvl="7">
       <w:start w:val="1"/>
       <w:numFmt w:val="bullet"/>
-      <w:lvlText w:val="○"/>
-      <w:lvlJc w:val="left"/>
-      <w:pPr>
-        <w:ind w:left="5760" w:hanging="360"/>
+      <w:lvlText w:val="-"/>
+      <w:lvlJc w:val="left"/>
+      <w:pPr>
+        <w:ind w:left="6480" w:hanging="360"/>
       </w:pPr>
       <w:rPr>
         <w:u w:val="none"/>
@@ -5697,10 +6339,10 @@
     <w:lvl w:ilvl="8">
       <w:start w:val="1"/>
       <w:numFmt w:val="bullet"/>
-      <w:lvlText w:val="■"/>
-      <w:lvlJc w:val="left"/>
-      <w:pPr>
-        <w:ind w:left="6480" w:hanging="360"/>
+      <w:lvlText w:val="-"/>
+      <w:lvlJc w:val="left"/>
+      <w:pPr>
+        <w:ind w:left="7200" w:hanging="360"/>
       </w:pPr>
       <w:rPr>
         <w:u w:val="none"/>
@@ -6591,7 +7233,19 @@
     <w:lvl w:ilvl="0">
       <w:start w:val="1"/>
       <w:numFmt w:val="bullet"/>
-      <w:lvlText w:val="-"/>
+      <w:lvlText w:val="●"/>
+      <w:lvlJc w:val="left"/>
+      <w:pPr>
+        <w:ind w:left="720" w:hanging="360"/>
+      </w:pPr>
+      <w:rPr>
+        <w:u w:val="none"/>
+      </w:rPr>
+    </w:lvl>
+    <w:lvl w:ilvl="1">
+      <w:start w:val="1"/>
+      <w:numFmt w:val="bullet"/>
+      <w:lvlText w:val="○"/>
       <w:lvlJc w:val="left"/>
       <w:pPr>
         <w:ind w:left="1440" w:hanging="360"/>
@@ -6600,10 +7254,10 @@
         <w:u w:val="none"/>
       </w:rPr>
     </w:lvl>
-    <w:lvl w:ilvl="1">
-      <w:start w:val="1"/>
-      <w:numFmt w:val="bullet"/>
-      <w:lvlText w:val="-"/>
+    <w:lvl w:ilvl="2">
+      <w:start w:val="1"/>
+      <w:numFmt w:val="bullet"/>
+      <w:lvlText w:val="■"/>
       <w:lvlJc w:val="left"/>
       <w:pPr>
         <w:ind w:left="2160" w:hanging="360"/>
@@ -6612,10 +7266,10 @@
         <w:u w:val="none"/>
       </w:rPr>
     </w:lvl>
-    <w:lvl w:ilvl="2">
-      <w:start w:val="1"/>
-      <w:numFmt w:val="bullet"/>
-      <w:lvlText w:val="-"/>
+    <w:lvl w:ilvl="3">
+      <w:start w:val="1"/>
+      <w:numFmt w:val="bullet"/>
+      <w:lvlText w:val="●"/>
       <w:lvlJc w:val="left"/>
       <w:pPr>
         <w:ind w:left="2880" w:hanging="360"/>
@@ -6624,10 +7278,10 @@
         <w:u w:val="none"/>
       </w:rPr>
     </w:lvl>
-    <w:lvl w:ilvl="3">
-      <w:start w:val="1"/>
-      <w:numFmt w:val="bullet"/>
-      <w:lvlText w:val="-"/>
+    <w:lvl w:ilvl="4">
+      <w:start w:val="1"/>
+      <w:numFmt w:val="bullet"/>
+      <w:lvlText w:val="○"/>
       <w:lvlJc w:val="left"/>
       <w:pPr>
         <w:ind w:left="3600" w:hanging="360"/>
@@ -6636,10 +7290,10 @@
         <w:u w:val="none"/>
       </w:rPr>
     </w:lvl>
-    <w:lvl w:ilvl="4">
-      <w:start w:val="1"/>
-      <w:numFmt w:val="bullet"/>
-      <w:lvlText w:val="-"/>
+    <w:lvl w:ilvl="5">
+      <w:start w:val="1"/>
+      <w:numFmt w:val="bullet"/>
+      <w:lvlText w:val="■"/>
       <w:lvlJc w:val="left"/>
       <w:pPr>
         <w:ind w:left="4320" w:hanging="360"/>
@@ -6648,10 +7302,10 @@
         <w:u w:val="none"/>
       </w:rPr>
     </w:lvl>
-    <w:lvl w:ilvl="5">
-      <w:start w:val="1"/>
-      <w:numFmt w:val="bullet"/>
-      <w:lvlText w:val="-"/>
+    <w:lvl w:ilvl="6">
+      <w:start w:val="1"/>
+      <w:numFmt w:val="bullet"/>
+      <w:lvlText w:val="●"/>
       <w:lvlJc w:val="left"/>
       <w:pPr>
         <w:ind w:left="5040" w:hanging="360"/>
@@ -6660,10 +7314,10 @@
         <w:u w:val="none"/>
       </w:rPr>
     </w:lvl>
-    <w:lvl w:ilvl="6">
-      <w:start w:val="1"/>
-      <w:numFmt w:val="bullet"/>
-      <w:lvlText w:val="-"/>
+    <w:lvl w:ilvl="7">
+      <w:start w:val="1"/>
+      <w:numFmt w:val="bullet"/>
+      <w:lvlText w:val="○"/>
       <w:lvlJc w:val="left"/>
       <w:pPr>
         <w:ind w:left="5760" w:hanging="360"/>
@@ -6672,25 +7326,13 @@
         <w:u w:val="none"/>
       </w:rPr>
     </w:lvl>
-    <w:lvl w:ilvl="7">
-      <w:start w:val="1"/>
-      <w:numFmt w:val="bullet"/>
-      <w:lvlText w:val="-"/>
+    <w:lvl w:ilvl="8">
+      <w:start w:val="1"/>
+      <w:numFmt w:val="bullet"/>
+      <w:lvlText w:val="■"/>
       <w:lvlJc w:val="left"/>
       <w:pPr>
         <w:ind w:left="6480" w:hanging="360"/>
-      </w:pPr>
-      <w:rPr>
-        <w:u w:val="none"/>
-      </w:rPr>
-    </w:lvl>
-    <w:lvl w:ilvl="8">
-      <w:start w:val="1"/>
-      <w:numFmt w:val="bullet"/>
-      <w:lvlText w:val="-"/>
-      <w:lvlJc w:val="left"/>
-      <w:pPr>
-        <w:ind w:left="7200" w:hanging="360"/>
       </w:pPr>
       <w:rPr>
         <w:u w:val="none"/>
@@ -6701,10 +7343,10 @@
     <w:lvl w:ilvl="0">
       <w:start w:val="1"/>
       <w:numFmt w:val="bullet"/>
-      <w:lvlText w:val="●"/>
-      <w:lvlJc w:val="left"/>
-      <w:pPr>
-        <w:ind w:left="720" w:hanging="360"/>
+      <w:lvlText w:val="-"/>
+      <w:lvlJc w:val="left"/>
+      <w:pPr>
+        <w:ind w:left="1440" w:hanging="360"/>
       </w:pPr>
       <w:rPr>
         <w:u w:val="none"/>
@@ -6713,10 +7355,10 @@
     <w:lvl w:ilvl="1">
       <w:start w:val="1"/>
       <w:numFmt w:val="bullet"/>
-      <w:lvlText w:val="○"/>
-      <w:lvlJc w:val="left"/>
-      <w:pPr>
-        <w:ind w:left="1440" w:hanging="360"/>
+      <w:lvlText w:val="-"/>
+      <w:lvlJc w:val="left"/>
+      <w:pPr>
+        <w:ind w:left="2160" w:hanging="360"/>
       </w:pPr>
       <w:rPr>
         <w:u w:val="none"/>
@@ -6725,10 +7367,10 @@
     <w:lvl w:ilvl="2">
       <w:start w:val="1"/>
       <w:numFmt w:val="bullet"/>
-      <w:lvlText w:val="■"/>
-      <w:lvlJc w:val="left"/>
-      <w:pPr>
-        <w:ind w:left="2160" w:hanging="360"/>
+      <w:lvlText w:val="-"/>
+      <w:lvlJc w:val="left"/>
+      <w:pPr>
+        <w:ind w:left="2880" w:hanging="360"/>
       </w:pPr>
       <w:rPr>
         <w:u w:val="none"/>
@@ -6737,10 +7379,10 @@
     <w:lvl w:ilvl="3">
       <w:start w:val="1"/>
       <w:numFmt w:val="bullet"/>
-      <w:lvlText w:val="●"/>
-      <w:lvlJc w:val="left"/>
-      <w:pPr>
-        <w:ind w:left="2880" w:hanging="360"/>
+      <w:lvlText w:val="-"/>
+      <w:lvlJc w:val="left"/>
+      <w:pPr>
+        <w:ind w:left="3600" w:hanging="360"/>
       </w:pPr>
       <w:rPr>
         <w:u w:val="none"/>
@@ -6749,10 +7391,10 @@
     <w:lvl w:ilvl="4">
       <w:start w:val="1"/>
       <w:numFmt w:val="bullet"/>
-      <w:lvlText w:val="○"/>
-      <w:lvlJc w:val="left"/>
-      <w:pPr>
-        <w:ind w:left="3600" w:hanging="360"/>
+      <w:lvlText w:val="-"/>
+      <w:lvlJc w:val="left"/>
+      <w:pPr>
+        <w:ind w:left="4320" w:hanging="360"/>
       </w:pPr>
       <w:rPr>
         <w:u w:val="none"/>
@@ -6761,10 +7403,10 @@
     <w:lvl w:ilvl="5">
       <w:start w:val="1"/>
       <w:numFmt w:val="bullet"/>
-      <w:lvlText w:val="■"/>
-      <w:lvlJc w:val="left"/>
-      <w:pPr>
-        <w:ind w:left="4320" w:hanging="360"/>
+      <w:lvlText w:val="-"/>
+      <w:lvlJc w:val="left"/>
+      <w:pPr>
+        <w:ind w:left="5040" w:hanging="360"/>
       </w:pPr>
       <w:rPr>
         <w:u w:val="none"/>
@@ -6773,10 +7415,10 @@
     <w:lvl w:ilvl="6">
       <w:start w:val="1"/>
       <w:numFmt w:val="bullet"/>
-      <w:lvlText w:val="●"/>
-      <w:lvlJc w:val="left"/>
-      <w:pPr>
-        <w:ind w:left="5040" w:hanging="360"/>
+      <w:lvlText w:val="-"/>
+      <w:lvlJc w:val="left"/>
+      <w:pPr>
+        <w:ind w:left="5760" w:hanging="360"/>
       </w:pPr>
       <w:rPr>
         <w:u w:val="none"/>
@@ -6785,10 +7427,10 @@
     <w:lvl w:ilvl="7">
       <w:start w:val="1"/>
       <w:numFmt w:val="bullet"/>
-      <w:lvlText w:val="○"/>
-      <w:lvlJc w:val="left"/>
-      <w:pPr>
-        <w:ind w:left="5760" w:hanging="360"/>
+      <w:lvlText w:val="-"/>
+      <w:lvlJc w:val="left"/>
+      <w:pPr>
+        <w:ind w:left="6480" w:hanging="360"/>
       </w:pPr>
       <w:rPr>
         <w:u w:val="none"/>
@@ -6797,10 +7439,10 @@
     <w:lvl w:ilvl="8">
       <w:start w:val="1"/>
       <w:numFmt w:val="bullet"/>
-      <w:lvlText w:val="■"/>
-      <w:lvlJc w:val="left"/>
-      <w:pPr>
-        <w:ind w:left="6480" w:hanging="360"/>
+      <w:lvlText w:val="-"/>
+      <w:lvlJc w:val="left"/>
+      <w:pPr>
+        <w:ind w:left="7200" w:hanging="360"/>
       </w:pPr>
       <w:rPr>
         <w:u w:val="none"/>
@@ -7128,6 +7770,226 @@
       <w:start w:val="1"/>
       <w:numFmt w:val="bullet"/>
       <w:lvlText w:val="■"/>
+      <w:lvlJc w:val="left"/>
+      <w:pPr>
+        <w:ind w:left="6480" w:hanging="360"/>
+      </w:pPr>
+      <w:rPr>
+        <w:u w:val="none"/>
+      </w:rPr>
+    </w:lvl>
+  </w:abstractNum>
+  <w:abstractNum w:abstractNumId="22">
+    <w:lvl w:ilvl="0">
+      <w:start w:val="1"/>
+      <w:numFmt w:val="bullet"/>
+      <w:lvlText w:val="●"/>
+      <w:lvlJc w:val="left"/>
+      <w:pPr>
+        <w:ind w:left="720" w:hanging="360"/>
+      </w:pPr>
+      <w:rPr>
+        <w:u w:val="none"/>
+      </w:rPr>
+    </w:lvl>
+    <w:lvl w:ilvl="1">
+      <w:start w:val="1"/>
+      <w:numFmt w:val="bullet"/>
+      <w:lvlText w:val="○"/>
+      <w:lvlJc w:val="left"/>
+      <w:pPr>
+        <w:ind w:left="1440" w:hanging="360"/>
+      </w:pPr>
+      <w:rPr>
+        <w:u w:val="none"/>
+      </w:rPr>
+    </w:lvl>
+    <w:lvl w:ilvl="2">
+      <w:start w:val="1"/>
+      <w:numFmt w:val="bullet"/>
+      <w:lvlText w:val="■"/>
+      <w:lvlJc w:val="left"/>
+      <w:pPr>
+        <w:ind w:left="2160" w:hanging="360"/>
+      </w:pPr>
+      <w:rPr>
+        <w:u w:val="none"/>
+      </w:rPr>
+    </w:lvl>
+    <w:lvl w:ilvl="3">
+      <w:start w:val="1"/>
+      <w:numFmt w:val="bullet"/>
+      <w:lvlText w:val="●"/>
+      <w:lvlJc w:val="left"/>
+      <w:pPr>
+        <w:ind w:left="2880" w:hanging="360"/>
+      </w:pPr>
+      <w:rPr>
+        <w:u w:val="none"/>
+      </w:rPr>
+    </w:lvl>
+    <w:lvl w:ilvl="4">
+      <w:start w:val="1"/>
+      <w:numFmt w:val="bullet"/>
+      <w:lvlText w:val="○"/>
+      <w:lvlJc w:val="left"/>
+      <w:pPr>
+        <w:ind w:left="3600" w:hanging="360"/>
+      </w:pPr>
+      <w:rPr>
+        <w:u w:val="none"/>
+      </w:rPr>
+    </w:lvl>
+    <w:lvl w:ilvl="5">
+      <w:start w:val="1"/>
+      <w:numFmt w:val="bullet"/>
+      <w:lvlText w:val="■"/>
+      <w:lvlJc w:val="left"/>
+      <w:pPr>
+        <w:ind w:left="4320" w:hanging="360"/>
+      </w:pPr>
+      <w:rPr>
+        <w:u w:val="none"/>
+      </w:rPr>
+    </w:lvl>
+    <w:lvl w:ilvl="6">
+      <w:start w:val="1"/>
+      <w:numFmt w:val="bullet"/>
+      <w:lvlText w:val="●"/>
+      <w:lvlJc w:val="left"/>
+      <w:pPr>
+        <w:ind w:left="5040" w:hanging="360"/>
+      </w:pPr>
+      <w:rPr>
+        <w:u w:val="none"/>
+      </w:rPr>
+    </w:lvl>
+    <w:lvl w:ilvl="7">
+      <w:start w:val="1"/>
+      <w:numFmt w:val="bullet"/>
+      <w:lvlText w:val="○"/>
+      <w:lvlJc w:val="left"/>
+      <w:pPr>
+        <w:ind w:left="5760" w:hanging="360"/>
+      </w:pPr>
+      <w:rPr>
+        <w:u w:val="none"/>
+      </w:rPr>
+    </w:lvl>
+    <w:lvl w:ilvl="8">
+      <w:start w:val="1"/>
+      <w:numFmt w:val="bullet"/>
+      <w:lvlText w:val="■"/>
+      <w:lvlJc w:val="left"/>
+      <w:pPr>
+        <w:ind w:left="6480" w:hanging="360"/>
+      </w:pPr>
+      <w:rPr>
+        <w:u w:val="none"/>
+      </w:rPr>
+    </w:lvl>
+  </w:abstractNum>
+  <w:abstractNum w:abstractNumId="23">
+    <w:lvl w:ilvl="0">
+      <w:start w:val="1"/>
+      <w:numFmt w:val="bullet"/>
+      <w:lvlText w:val="-"/>
+      <w:lvlJc w:val="left"/>
+      <w:pPr>
+        <w:ind w:left="720" w:hanging="360"/>
+      </w:pPr>
+      <w:rPr>
+        <w:u w:val="none"/>
+      </w:rPr>
+    </w:lvl>
+    <w:lvl w:ilvl="1">
+      <w:start w:val="1"/>
+      <w:numFmt w:val="bullet"/>
+      <w:lvlText w:val="-"/>
+      <w:lvlJc w:val="left"/>
+      <w:pPr>
+        <w:ind w:left="1440" w:hanging="360"/>
+      </w:pPr>
+      <w:rPr>
+        <w:u w:val="none"/>
+      </w:rPr>
+    </w:lvl>
+    <w:lvl w:ilvl="2">
+      <w:start w:val="1"/>
+      <w:numFmt w:val="bullet"/>
+      <w:lvlText w:val="-"/>
+      <w:lvlJc w:val="left"/>
+      <w:pPr>
+        <w:ind w:left="2160" w:hanging="360"/>
+      </w:pPr>
+      <w:rPr>
+        <w:u w:val="none"/>
+      </w:rPr>
+    </w:lvl>
+    <w:lvl w:ilvl="3">
+      <w:start w:val="1"/>
+      <w:numFmt w:val="bullet"/>
+      <w:lvlText w:val="-"/>
+      <w:lvlJc w:val="left"/>
+      <w:pPr>
+        <w:ind w:left="2880" w:hanging="360"/>
+      </w:pPr>
+      <w:rPr>
+        <w:u w:val="none"/>
+      </w:rPr>
+    </w:lvl>
+    <w:lvl w:ilvl="4">
+      <w:start w:val="1"/>
+      <w:numFmt w:val="bullet"/>
+      <w:lvlText w:val="-"/>
+      <w:lvlJc w:val="left"/>
+      <w:pPr>
+        <w:ind w:left="3600" w:hanging="360"/>
+      </w:pPr>
+      <w:rPr>
+        <w:u w:val="none"/>
+      </w:rPr>
+    </w:lvl>
+    <w:lvl w:ilvl="5">
+      <w:start w:val="1"/>
+      <w:numFmt w:val="bullet"/>
+      <w:lvlText w:val="-"/>
+      <w:lvlJc w:val="left"/>
+      <w:pPr>
+        <w:ind w:left="4320" w:hanging="360"/>
+      </w:pPr>
+      <w:rPr>
+        <w:u w:val="none"/>
+      </w:rPr>
+    </w:lvl>
+    <w:lvl w:ilvl="6">
+      <w:start w:val="1"/>
+      <w:numFmt w:val="bullet"/>
+      <w:lvlText w:val="-"/>
+      <w:lvlJc w:val="left"/>
+      <w:pPr>
+        <w:ind w:left="5040" w:hanging="360"/>
+      </w:pPr>
+      <w:rPr>
+        <w:u w:val="none"/>
+      </w:rPr>
+    </w:lvl>
+    <w:lvl w:ilvl="7">
+      <w:start w:val="1"/>
+      <w:numFmt w:val="bullet"/>
+      <w:lvlText w:val="-"/>
+      <w:lvlJc w:val="left"/>
+      <w:pPr>
+        <w:ind w:left="5760" w:hanging="360"/>
+      </w:pPr>
+      <w:rPr>
+        <w:u w:val="none"/>
+      </w:rPr>
+    </w:lvl>
+    <w:lvl w:ilvl="8">
+      <w:start w:val="1"/>
+      <w:numFmt w:val="bullet"/>
+      <w:lvlText w:val="-"/>
       <w:lvlJc w:val="left"/>
       <w:pPr>
         <w:ind w:left="6480" w:hanging="360"/>
@@ -7199,6 +8061,12 @@
   </w:num>
   <w:num w:numId="21">
     <w:abstractNumId w:val="21"/>
+  </w:num>
+  <w:num w:numId="22">
+    <w:abstractNumId w:val="22"/>
+  </w:num>
+  <w:num w:numId="23">
+    <w:abstractNumId w:val="23"/>
   </w:num>
 </w:numbering>
 </file>

</xml_diff>